<commit_message>
feat(checkout): integrar flujo de cobro real Mercado Pago y Webpay a 1000 CLP, auditoria y sincronizacion
</commit_message>
<xml_diff>
--- a/DESCARGA_LECCIONES/Plan_Maestro_7Básico_110-7-CIE-OA01_6Lecciones.docx
+++ b/DESCARGA_LECCIONES/Plan_Maestro_7Básico_110-7-CIE-OA01_6Lecciones.docx
@@ -1322,7 +1322,7 @@
                 <w:sz w:val="17"/>
                 <w:szCs w:val="17"/>
               </w:rPr>
-              <w:t xml:space="preserve">Duración asignada: 9 s</w:t>
+              <w:t xml:space="preserve">Duración asignada: 10 s</w:t>
             </w:r>
           </w:p>
         </w:tc>
@@ -1402,7 +1402,7 @@
                 <w:sz w:val="17"/>
                 <w:szCs w:val="17"/>
               </w:rPr>
-              <w:t xml:space="preserve">Modern anime style 16:9 widescreen illustration. Two 13-year-old student explorers, a girl with braided hair and a boy in a teal jacket, examining a glowing interactive holographic infographic of the 4 dimensions of human sexuality. Warm, inviting scientific atmosphere, negative space in top third. No text drawn by AI.</w:t>
+              <w:t xml:space="preserve">Modern anime style 16:9 widescreen illustration. Two 13-year-old student explorers, a girl with braided hair and a boy in a teal jacket, examining a glowing interactive holographic infographic of the 4 dimensions of human sexuality in a warm scientific atmosphere, with generous negative space for text overlays. No text drawn by AI.</w:t>
             </w:r>
           </w:p>
           <w:p>
@@ -1445,7 +1445,7 @@
                 <w:sz w:val="18"/>
                 <w:szCs w:val="18"/>
               </w:rPr>
-              <w:t xml:space="preserve">Comienza una expedición fascinante en ciencias. La sexualidad humana es una vivencia integral que nos acompaña durante todas las etapas de nuestra vida.</w:t>
+              <w:t xml:space="preserve">Comienza una expedición fascinante en ciencias. La sexualidad humana es una vivencia integral presente en todas las etapas de nuestra vida.</w:t>
             </w:r>
           </w:p>
         </w:tc>
@@ -1497,7 +1497,7 @@
                 <w:sz w:val="17"/>
                 <w:szCs w:val="17"/>
               </w:rPr>
-              <w:t xml:space="preserve">Duración asignada: 9 s</w:t>
+              <w:t xml:space="preserve">Duración asignada: 8 s</w:t>
             </w:r>
           </w:p>
         </w:tc>
@@ -1577,7 +1577,7 @@
                 <w:sz w:val="17"/>
                 <w:szCs w:val="17"/>
               </w:rPr>
-              <w:t xml:space="preserve">Modern anime style. Clean anatomical growth chart showing developmental milestones of puberty, height markers, and secondary sexual characteristics. High clarity, medical illustration style. No text drawn by AI.</w:t>
+              <w:t xml:space="preserve">Modern anime style 16:9 widescreen illustration. Two 13-year-old student explorers, a girl with braided hair and a boy in a teal jacket, analyzing a clean anatomical growth chart showing developmental milestones of puberty and height markers with clinical clarity, with generous negative space for text overlays. No text drawn by AI.</w:t>
             </w:r>
           </w:p>
           <w:p>
@@ -1672,7 +1672,7 @@
                 <w:sz w:val="17"/>
                 <w:szCs w:val="17"/>
               </w:rPr>
-              <w:t xml:space="preserve">Duración asignada: 9 s</w:t>
+              <w:t xml:space="preserve">Duración asignada: 10 s</w:t>
             </w:r>
           </w:p>
         </w:tc>
@@ -1752,7 +1752,7 @@
                 <w:sz w:val="17"/>
                 <w:szCs w:val="17"/>
               </w:rPr>
-              <w:t xml:space="preserve">Modern anime style. Close-up of adolescents sharing a sincere laugh, icons of heart and brain softly illuminated. Warm morning light, emotional connection. No text drawn by AI.</w:t>
+              <w:t xml:space="preserve">Modern anime style 16:9 widescreen illustration. Two 13-year-old student explorers, a girl with braided hair and a boy in a teal jacket, sharing a sincere laugh in a sunlit school courtyard, with softly illuminated icons of heart and brain symbolizing emotional connection, with generous negative space for text overlays. No text drawn by AI.</w:t>
             </w:r>
           </w:p>
           <w:p>
@@ -1847,7 +1847,7 @@
                 <w:sz w:val="17"/>
                 <w:szCs w:val="17"/>
               </w:rPr>
-              <w:t xml:space="preserve">Duración asignada: 10 s</w:t>
+              <w:t xml:space="preserve">Duración asignada: 9 s</w:t>
             </w:r>
           </w:p>
         </w:tc>
@@ -1927,7 +1927,7 @@
                 <w:sz w:val="17"/>
                 <w:szCs w:val="17"/>
               </w:rPr>
-              <w:t xml:space="preserve">Modern anime style. Diverse group of young students collaborating in a bright park, talking respectfully with families and friends. Crisp clean composition. No text drawn by AI.</w:t>
+              <w:t xml:space="preserve">Modern anime style 16:9 widescreen illustration. Two 13-year-old student explorers, a girl with braided hair and a boy in a teal jacket, collaborating respectfully with a diverse group of young students and families in a bright park, with generous negative space for text overlays. No text drawn by AI.</w:t>
             </w:r>
           </w:p>
           <w:p>
@@ -1970,7 +1970,7 @@
                 <w:sz w:val="18"/>
                 <w:szCs w:val="18"/>
               </w:rPr>
-              <w:t xml:space="preserve">Se manifiesta en cómo convivimos día a día, compartiendo experiencias con la familia, participando en el colegio y dialogando con nuestro grupo de amigos.</w:t>
+              <w:t xml:space="preserve">Se manifiesta en cómo convivimos día a día, compartiendo experiencias con la familia, en la escuela y dialogando con amigos.</w:t>
             </w:r>
           </w:p>
         </w:tc>
@@ -2102,7 +2102,7 @@
                 <w:sz w:val="17"/>
                 <w:szCs w:val="17"/>
               </w:rPr>
-              <w:t xml:space="preserve">Modern anime style. Balance scale emblem with glowing symbols of respect, personal limits, consent, and mutual dignity. Clear negative space. No text drawn by AI.</w:t>
+              <w:t xml:space="preserve">Modern anime style 16:9 widescreen illustration. Two 13-year-old student explorers, a girl with braided hair and a boy in a teal jacket, observing a balanced scale emblem with glowing symbols of respect, personal limits, consent, and mutual dignity, with generous negative space for text overlays. No text drawn by AI.</w:t>
             </w:r>
           </w:p>
           <w:p>
@@ -2145,7 +2145,7 @@
                 <w:sz w:val="18"/>
                 <w:szCs w:val="18"/>
               </w:rPr>
-              <w:t xml:space="preserve">Guía nuestras decisiones morales a través del respeto incondicional a la dignidad humana, la valoración de límites personales y el consentimiento mutuo.</w:t>
+              <w:t xml:space="preserve">Guía nuestras decisiones morales a través del respeto incondicional a la dignidad humana, límites personales y el consentimiento mutuo.</w:t>
             </w:r>
           </w:p>
         </w:tc>
@@ -2197,7 +2197,7 @@
                 <w:sz w:val="17"/>
                 <w:szCs w:val="17"/>
               </w:rPr>
-              <w:t xml:space="preserve">Duración asignada: 9 s</w:t>
+              <w:t xml:space="preserve">Duración asignada: 8 s</w:t>
             </w:r>
           </w:p>
         </w:tc>
@@ -2277,7 +2277,7 @@
                 <w:sz w:val="17"/>
                 <w:szCs w:val="17"/>
               </w:rPr>
-              <w:t xml:space="preserve">Modern anime style. The four dimensions connecting dynamically with glowing energetic nodes around a human silhouette. High visual impact, harmony. No text drawn by AI.</w:t>
+              <w:t xml:space="preserve">Modern anime style 16:9 widescreen illustration. Two 13-year-old student explorers, a girl with braided hair and a boy in a teal jacket, observing the four dimensions connecting dynamically with glowing energetic nodes around a human silhouette, with generous negative space for text overlays. No text drawn by AI.</w:t>
             </w:r>
           </w:p>
           <w:p>
@@ -2320,7 +2320,7 @@
                 <w:sz w:val="18"/>
                 <w:szCs w:val="18"/>
               </w:rPr>
-              <w:t xml:space="preserve">Ninguna dimensión funciona aislada de las demás. Lo que experimenta nuestro cuerpo repercute en nuestras emociones y moldea nuestras relaciones comunitarias.</w:t>
+              <w:t xml:space="preserve">Ninguna dimensión funciona aislada. Lo que experimenta nuestro cuerpo repercute en nuestras emociones y moldea nuestras relaciones comunitarias.</w:t>
             </w:r>
           </w:p>
         </w:tc>
@@ -2452,7 +2452,7 @@
                 <w:sz w:val="17"/>
                 <w:szCs w:val="17"/>
               </w:rPr>
-              <w:t xml:space="preserve">Modern anime style. Both explorers smiling, ready to investigate everyday cases with their science notebooks open. StudioSimple badge. No text drawn by AI.</w:t>
+              <w:t xml:space="preserve">Modern anime style 16:9 widescreen illustration. Two 13-year-old student explorers, a girl with braided hair and a boy in a teal jacket, smiling ready to investigate everyday cases with their science notebooks open beside a StudioSimple badge, with generous negative space for text overlays. No text drawn by AI.</w:t>
             </w:r>
           </w:p>
           <w:p>
@@ -2495,7 +2495,7 @@
                 <w:sz w:val="18"/>
                 <w:szCs w:val="18"/>
               </w:rPr>
-              <w:t xml:space="preserve">Ahora surge la gran pregunta: cuando enfrentamos un cambio en nuestra adolescencia, ¿cómo interactúan estas cuatro dimensiones al mismo tiempo?</w:t>
+              <w:t xml:space="preserve">Ahora surge la gran pregunta: al enfrentar un cambio en nuestra adolescencia, ¿cómo interactúan estas cuatro dimensiones al mismo tiempo?</w:t>
             </w:r>
           </w:p>
         </w:tc>
@@ -3048,7 +3048,7 @@
                 <w:sz w:val="17"/>
                 <w:szCs w:val="17"/>
               </w:rPr>
-              <w:t xml:space="preserve">Modern anime style 16:9. The boy and girl standing before a clear 4-quadrant lightboard: 'Biológica', 'Afectiva', 'Social' y 'Ética'. Clean modern typography. No text drawn by AI.</w:t>
+              <w:t xml:space="preserve">Modern anime style 16:9 widescreen illustration. Two 13-year-old student explorers, a girl with braided hair and a boy in a teal jacket, standing before a clear 4-quadrant lightboard representing biological, affective, social, and ethical dimensions, with generous negative space for text overlays. No text drawn by AI.</w:t>
             </w:r>
           </w:p>
           <w:p>
@@ -3091,7 +3091,7 @@
                 <w:sz w:val="18"/>
                 <w:szCs w:val="18"/>
               </w:rPr>
-              <w:t xml:space="preserve">El objetivo de hoy es aprender a reconocer y explicar que la sexualidad humana está conformada por cuatro dimensiones inseparables: biológica, afectiva, social y ética.</w:t>
+              <w:t xml:space="preserve">El objetivo de la lección es reconocer y explicar que la sexualidad humana está conformada por cuatro dimensiones inseparables: biológica, afectiva, social y ética.</w:t>
             </w:r>
           </w:p>
         </w:tc>
@@ -3143,7 +3143,7 @@
                 <w:sz w:val="17"/>
                 <w:szCs w:val="17"/>
               </w:rPr>
-              <w:t xml:space="preserve">Duración asignada: 12 s</w:t>
+              <w:t xml:space="preserve">Duración asignada: 10 s</w:t>
             </w:r>
           </w:p>
         </w:tc>
@@ -3223,7 +3223,7 @@
                 <w:sz w:val="17"/>
                 <w:szCs w:val="17"/>
               </w:rPr>
-              <w:t xml:space="preserve">Modern anime style. The girl pointing at growth metrics, voice change diagrams, and cellular maturation charts. Clear clinical clarity. No text drawn by AI.</w:t>
+              <w:t xml:space="preserve">Modern anime style 16:9 widescreen illustration. Two 13-year-old student explorers, a girl with braided hair and a boy in a teal jacket, analyzing growth metrics, voice change diagrams, and cellular maturation charts on a holographic display with clinical clarity, with generous negative space for text overlays. No text drawn by AI.</w:t>
             </w:r>
           </w:p>
           <w:p>
@@ -3266,7 +3266,7 @@
                 <w:sz w:val="18"/>
                 <w:szCs w:val="18"/>
               </w:rPr>
-              <w:t xml:space="preserve">En la pubertad, el sistema endocrino libera señales químicas que inician el estirón puberal, el desarrollo reproductivo y cambios visibles en la piel, masa muscular y voz.</w:t>
+              <w:t xml:space="preserve">En la pubertad, el sistema endocrino libera señales químicas que inician el estirón puberal, el desarrollo reproductivo y cambios visibles corporales.</w:t>
             </w:r>
           </w:p>
         </w:tc>
@@ -3398,7 +3398,7 @@
                 <w:sz w:val="17"/>
                 <w:szCs w:val="17"/>
               </w:rPr>
-              <w:t xml:space="preserve">Modern anime style. The boy reflecting on emotional self-worth and family bonds with gentle warm ambient lighting. Negative space on left. No text drawn by AI.</w:t>
+              <w:t xml:space="preserve">Modern anime style 16:9 widescreen illustration. Two 13-year-old student explorers, a girl with braided hair and a boy in a teal jacket, reflecting on emotional self-worth, feelings, and family bonds with gentle warm ambient lighting, with generous negative space for text overlays. No text drawn by AI.</w:t>
             </w:r>
           </w:p>
           <w:p>
@@ -3573,7 +3573,7 @@
                 <w:sz w:val="17"/>
                 <w:szCs w:val="17"/>
               </w:rPr>
-              <w:t xml:space="preserve">Modern anime style. Young adolescents participating in school and family dialogues, showing open active listening. Soft depth of field. No text drawn by AI.</w:t>
+              <w:t xml:space="preserve">Modern anime style 16:9 widescreen illustration. Two 13-year-old student explorers, a girl with braided hair and a boy in a teal jacket, participating in school and family dialogues with peers, showing open active listening in a bright library, with generous negative space for text overlays. No text drawn by AI.</w:t>
             </w:r>
           </w:p>
           <w:p>
@@ -3668,7 +3668,7 @@
                 <w:sz w:val="17"/>
                 <w:szCs w:val="17"/>
               </w:rPr>
-              <w:t xml:space="preserve">Duración asignada: 13 s</w:t>
+              <w:t xml:space="preserve">Duración asignada: 12 s</w:t>
             </w:r>
           </w:p>
         </w:tc>
@@ -3748,7 +3748,7 @@
                 <w:sz w:val="17"/>
                 <w:szCs w:val="17"/>
               </w:rPr>
-              <w:t xml:space="preserve">Modern anime style. Two hands shaking with dignity and mutual respect. Icon of personal boundaries and safety shield in glowing cyan. No text drawn by AI.</w:t>
+              <w:t xml:space="preserve">Modern anime style 16:9 widescreen illustration. Two 13-year-old student explorers, a girl with braided hair and a boy in a teal jacket, holding a glowing cyan emblem of mutual respect, personal boundaries, and dignity, with generous negative space for text overlays. No text drawn by AI.</w:t>
             </w:r>
           </w:p>
           <w:p>
@@ -3791,7 +3791,7 @@
                 <w:sz w:val="18"/>
                 <w:szCs w:val="18"/>
               </w:rPr>
-              <w:t xml:space="preserve">El eje ético establece que el cuerpo de cada individuo es inviolable. Toda relación humana sana se funda en la dignidad, la honestidad y el consentimiento libre y mutuo.</w:t>
+              <w:t xml:space="preserve">El eje ético establece que el cuerpo de cada individuo es inviolable. Toda relación humana sana se funda en la dignidad, honestidad y consentimiento libre y mutuo.</w:t>
             </w:r>
           </w:p>
         </w:tc>
@@ -3843,7 +3843,7 @@
                 <w:sz w:val="17"/>
                 <w:szCs w:val="17"/>
               </w:rPr>
-              <w:t xml:space="preserve">Duración asignada: 20 s</w:t>
+              <w:t xml:space="preserve">Duración asignada: 19 s</w:t>
             </w:r>
           </w:p>
         </w:tc>
@@ -3923,7 +3923,7 @@
                 <w:sz w:val="17"/>
                 <w:szCs w:val="17"/>
               </w:rPr>
-              <w:t xml:space="preserve">Modern anime style 16:9. The boy and girl reviewing an illustrated daily hygiene, sleep schedule, and healthy meal chart on a study desk. Clean lineart, soft ambient lighting. No text drawn by AI.</w:t>
+              <w:t xml:space="preserve">Modern anime style 16:9 widescreen illustration. Two 13-year-old student explorers, a girl with braided hair and a boy in a teal jacket, reviewing an illustrated daily hygiene, sleep schedule, and healthy meal chart on a study desk with clean lineart, with generous negative space for text overlays. No text drawn by AI.</w:t>
             </w:r>
           </w:p>
           <w:p>
@@ -4018,7 +4018,7 @@
                 <w:sz w:val="17"/>
                 <w:szCs w:val="17"/>
               </w:rPr>
-              <w:t xml:space="preserve">Duración asignada: 11 s</w:t>
+              <w:t xml:space="preserve">Duración asignada: 13 s</w:t>
             </w:r>
           </w:p>
         </w:tc>
@@ -4098,7 +4098,7 @@
                 <w:sz w:val="17"/>
                 <w:szCs w:val="17"/>
               </w:rPr>
-              <w:t xml:space="preserve">Modern anime style. StudioSimple emblem alongside a prominent balance diagram with all four dimensions working in dynamic equilibrium. Clean lines. No text drawn by AI.</w:t>
+              <w:t xml:space="preserve">Modern anime style 16:9 widescreen illustration. Two 13-year-old student explorers, a girl with braided hair and a boy in a teal jacket, presenting a prominent balance diagram with all four dimensions working in dynamic equilibrium beside a StudioSimple emblem, with generous negative space for text overlays. No text drawn by AI.</w:t>
             </w:r>
           </w:p>
           <w:p>
@@ -4141,7 +4141,7 @@
                 <w:sz w:val="18"/>
                 <w:szCs w:val="18"/>
               </w:rPr>
-              <w:t xml:space="preserve">Recuerda la regla de oro: la sexualidad es integral. ¡Ahora demostraremos lo aprendido aplicando este modelo en las situaciones prácticas de la plataforma interactiva!</w:t>
+              <w:t xml:space="preserve">Recuerda la regla de oro: la sexualidad es integral. Une cuerpo, emociones, sociedad y valores. ¡Ahora pon a prueba lo aprendido resolviendo las actividades prácticas en la plataforma interactiva!</w:t>
             </w:r>
           </w:p>
         </w:tc>
@@ -4169,10 +4169,10 @@
           <w:b/>
           <w:bCs/>
         </w:rPr>
-        <w:t xml:space="preserve">Comprobación 1 (Interrelación de dimensiones): </w:t>
-      </w:r>
-      <w:r>
-        <w:t xml:space="preserve">Si una persona siente timidez o alegría ante los cambios de su cuerpo en la pubertad, ¿qué dimensiones están interactuando?</w:t>
+        <w:t xml:space="preserve">Comprobación 1 (Caso 1: Cuidado de la higiene y descanso): </w:t>
+      </w:r>
+      <w:r>
+        <w:t xml:space="preserve">El hábito de bañarse diariamente, usar ropa limpia y dormir ocho horas para cuidar el cuerpo durante el crecimiento, ¿a qué dimensión corresponde?</w:t>
       </w:r>
     </w:p>
     <w:p>
@@ -4188,7 +4188,7 @@
         <w:t xml:space="preserve">• Respuesta esperada: </w:t>
       </w:r>
       <w:r>
-        <w:t xml:space="preserve">Están interactuando la dimensión biológica (los cambios corporales) y la dimensión afectiva (los sentimientos y emociones).</w:t>
+        <w:t xml:space="preserve">Corresponde a la dimensión biológica, ya que se relaciona con el cuidado y funcionamiento saludable del organismo.</w:t>
       </w:r>
       <w:r>
         <w:rPr>
@@ -4199,7 +4199,7 @@
         <w:t xml:space="preserve"> | Pista socrática: </w:t>
       </w:r>
       <w:r>
-        <w:t xml:space="preserve">Identifica los dos elementos del ejemplo: "cambios del cuerpo" corresponde a una dimensión, y "sentir timidez o alegría" corresponde a otra. ¿Cuáles son?</w:t>
+        <w:t xml:space="preserve">Piensa a qué parte de la persona beneficia directamente el descanso y la limpieza: ¿al cuerpo físico, a las leyes o a la economía?</w:t>
       </w:r>
     </w:p>
     <w:p>
@@ -4215,7 +4215,7 @@
         <w:t xml:space="preserve">• Texto revelado al estudiante: </w:t>
       </w:r>
       <w:r>
-        <w:t xml:space="preserve">La dimensión biológica (el cuerpo) y la dimensión afectiva (las emociones).</w:t>
+        <w:t xml:space="preserve">Dimensión biológica (salud y cuidado del cuerpo).</w:t>
       </w:r>
     </w:p>
     <w:p>
@@ -4227,10 +4227,10 @@
           <w:b/>
           <w:bCs/>
         </w:rPr>
-        <w:t xml:space="preserve">Comprobación 2 (El valor del respeto mutuo): </w:t>
-      </w:r>
-      <w:r>
-        <w:t xml:space="preserve">Cuando un grupo de amigos decide escuchar y respetar los límites y la privacidad de cada integrante, ¿qué dimensión destaca principalmente?</w:t>
+        <w:t xml:space="preserve">Comprobación 2 (Caso 2: Expresión de afecto en la familia): </w:t>
+      </w:r>
+      <w:r>
+        <w:t xml:space="preserve">Conversar con honestidad con los padres sobre los temores o dudas que surgen en la adolescencia, ¿qué dimensiones involucra?</w:t>
       </w:r>
     </w:p>
     <w:p>
@@ -4246,7 +4246,7 @@
         <w:t xml:space="preserve">• Respuesta esperada: </w:t>
       </w:r>
       <w:r>
-        <w:t xml:space="preserve">Destaca la dimensión ética y moral, complementada con la dimensión social de convivencia.</w:t>
+        <w:t xml:space="preserve">Involucra la dimensión afectiva (expresar emociones y confianza) y la dimensión social (el vínculo familiar).</w:t>
       </w:r>
       <w:r>
         <w:rPr>
@@ -4257,7 +4257,7 @@
         <w:t xml:space="preserve"> | Pista socrática: </w:t>
       </w:r>
       <w:r>
-        <w:t xml:space="preserve">Fíjate en las palabras clave: "respetar límites", "valores" y "decisión responsable". ¿A qué dimensión corresponde?</w:t>
+        <w:t xml:space="preserve">Piensa en las emociones compartidas (afecto) y en las personas con las que vives y convives (familia/social). ¿Qué dimensiones son?</w:t>
       </w:r>
     </w:p>
     <w:p>
@@ -4273,7 +4273,7 @@
         <w:t xml:space="preserve">• Texto revelado al estudiante: </w:t>
       </w:r>
       <w:r>
-        <w:t xml:space="preserve">La dimensión ética y moral (valores de respeto y límites).</w:t>
+        <w:t xml:space="preserve">Dimensión afectiva (emociones) y dimensión social (familia).</w:t>
       </w:r>
     </w:p>
     <w:p>
@@ -6270,7 +6270,7 @@
                 <w:sz w:val="17"/>
                 <w:szCs w:val="17"/>
               </w:rPr>
-              <w:t xml:space="preserve">Modern anime style 16:9 widescreen illustration. Two 13-year-old student explorers, a girl with braided hair and a boy in a teal jacket, examining a glowing timeline of human growth in a bright science lab. Warm morning lighting, clean negative space in upper third. No text drawn by AI.</w:t>
+              <w:t xml:space="preserve">Modern anime style 16:9 widescreen illustration. Two 13-year-old student explorers, a girl with braided hair and a boy in a teal jacket, examining a glowing timeline of human growth in a bright science lab, observing the endocrine transition, with generous negative space for text overlays. No text drawn by AI.</w:t>
             </w:r>
           </w:p>
           <w:p>
@@ -6313,7 +6313,7 @@
                 <w:sz w:val="18"/>
                 <w:szCs w:val="18"/>
               </w:rPr>
-              <w:t xml:space="preserve">Comienza una nueva expedición en ciencias. La pubertad marca el inicio de transformaciones corporales y emocionales guiadas por señales químicas precisas.</w:t>
+              <w:t xml:space="preserve">Comienza una expedición en ciencias. La pubertad marca el inicio de cambios corporales y emocionales guiados por señales químicas.</w:t>
             </w:r>
           </w:p>
         </w:tc>
@@ -6445,7 +6445,7 @@
                 <w:sz w:val="17"/>
                 <w:szCs w:val="17"/>
               </w:rPr>
-              <w:t xml:space="preserve">Modern anime style. Medical diagram in a clean holographic sphere showing the brain, pituitary gland, and hormonal signals descending through the body. Crisp lines. No text drawn by AI.</w:t>
+              <w:t xml:space="preserve">Modern anime style 16:9 widescreen illustration. Two 13-year-old student explorers, a girl with braided hair and a boy in a teal jacket, examining a medical diagram in a clean holographic sphere showing the pituitary gland and descending hormonal signals, with generous negative space for text overlays. No text drawn by AI.</w:t>
             </w:r>
           </w:p>
           <w:p>
@@ -6488,7 +6488,7 @@
                 <w:sz w:val="18"/>
                 <w:szCs w:val="18"/>
               </w:rPr>
-              <w:t xml:space="preserve">En la base del cerebro, la glándula hipófisis emite hormonas que despiertan a los ovarios y testículos para comenzar la maduración reproductiva.</w:t>
+              <w:t xml:space="preserve">En la base del cerebro, la hipófisis emite hormonas que despiertan a los ovarios y testículos para comenzar la maduración.</w:t>
             </w:r>
           </w:p>
         </w:tc>
@@ -6540,7 +6540,7 @@
                 <w:sz w:val="17"/>
                 <w:szCs w:val="17"/>
               </w:rPr>
-              <w:t xml:space="preserve">Duración asignada: 9 s</w:t>
+              <w:t xml:space="preserve">Duración asignada: 8 s</w:t>
             </w:r>
           </w:p>
         </w:tc>
@@ -6620,7 +6620,7 @@
                 <w:sz w:val="17"/>
                 <w:szCs w:val="17"/>
               </w:rPr>
-              <w:t xml:space="preserve">Modern anime style. Two adolescent characters studying an anatomical diagram of the reproductive organs with respectful scientific curiosity. Clear negative space on left. No text drawn by AI.</w:t>
+              <w:t xml:space="preserve">Modern anime style 16:9 widescreen illustration. Two 13-year-old student explorers, a girl with braided hair and a boy in a teal jacket, studying an anatomical diagram of primary reproductive organs present from birth with respectful scientific curiosity, with generous negative space for text overlays. No text drawn by AI.</w:t>
             </w:r>
           </w:p>
           <w:p>
@@ -6663,7 +6663,7 @@
                 <w:sz w:val="18"/>
                 <w:szCs w:val="18"/>
               </w:rPr>
-              <w:t xml:space="preserve">Los caracteres sexuales primarios corresponden a los órganos reproductores. Están formados desde la gestación y nos acompañan desde nuestro nacimiento.</w:t>
+              <w:t xml:space="preserve">Los caracteres primarios son los órganos reproductores. Están formados desde la gestación y nos acompañan desde el nacimiento.</w:t>
             </w:r>
           </w:p>
         </w:tc>
@@ -6795,7 +6795,7 @@
                 <w:sz w:val="17"/>
                 <w:szCs w:val="17"/>
               </w:rPr>
-              <w:t xml:space="preserve">Modern anime style. Comparison silhouettes illustrating height markers, shoulder broadening, pelvic changes, and facial feature maturation. Crisp clean art. No text drawn by AI.</w:t>
+              <w:t xml:space="preserve">Modern anime style 16:9 widescreen illustration. Two 13-year-old student explorers, a girl with braided hair and a boy in a teal jacket, observing comparison silhouettes illustrating height markers, shoulder broadening, and vocal changes of puberty, with generous negative space for text overlays. No text drawn by AI.</w:t>
             </w:r>
           </w:p>
           <w:p>
@@ -6838,7 +6838,7 @@
                 <w:sz w:val="18"/>
                 <w:szCs w:val="18"/>
               </w:rPr>
-              <w:t xml:space="preserve">En la pubertad surgen los caracteres secundarios: aumento de estatura, ensanchamiento corporal, cambio en el tono de voz y aparición de vello.</w:t>
+              <w:t xml:space="preserve">En la pubertad surgen los caracteres secundarios: aumento de estatura, cambio en el tono de voz y aparición de vello.</w:t>
             </w:r>
           </w:p>
         </w:tc>
@@ -6890,7 +6890,7 @@
                 <w:sz w:val="17"/>
                 <w:szCs w:val="17"/>
               </w:rPr>
-              <w:t xml:space="preserve">Duración asignada: 9 s</w:t>
+              <w:t xml:space="preserve">Duración asignada: 8 s</w:t>
             </w:r>
           </w:p>
         </w:tc>
@@ -6970,7 +6970,7 @@
                 <w:sz w:val="17"/>
                 <w:szCs w:val="17"/>
               </w:rPr>
-              <w:t xml:space="preserve">Modern anime style. The boy and girl reflecting outdoors under a gentle autumn tree, expressing introspection and camaraderie. Warm expressive eyes. No text drawn by AI.</w:t>
+              <w:t xml:space="preserve">Modern anime style 16:9 widescreen illustration. Two 13-year-old student explorers, a girl with braided hair and a boy in a teal jacket, reflecting outdoors under a gentle autumn tree, expressing camaraderie and emotional growth in the pubertal stage, with generous negative space for text overlays. No text drawn by AI.</w:t>
             </w:r>
           </w:p>
           <w:p>
@@ -7013,7 +7013,7 @@
                 <w:sz w:val="18"/>
                 <w:szCs w:val="18"/>
               </w:rPr>
-              <w:t xml:space="preserve">Las hormonas también influyen en los afectos. Experimentamos cambios de ánimo, mayor curiosidad y la necesidad de construir nuestra propia identidad personal.</w:t>
+              <w:t xml:space="preserve">Las hormonas también influyen en los afectos. Experimentamos cambios de ánimo y la necesidad de construir nuestra identidad.</w:t>
             </w:r>
           </w:p>
         </w:tc>
@@ -7145,7 +7145,7 @@
                 <w:sz w:val="17"/>
                 <w:szCs w:val="17"/>
               </w:rPr>
-              <w:t xml:space="preserve">Modern anime style. Diverse group of healthy teenage friends of different heights and physical builds smiling together in school uniforms. No text drawn by AI.</w:t>
+              <w:t xml:space="preserve">Modern anime style 16:9 widescreen illustration. Two 13-year-old student explorers, a girl with braided hair and a boy in a teal jacket, interacting with healthy teenage friends of different heights and physical builds, observing diverse growth rhythms between 10 and 16 years, with generous negative space for text overlays. No text drawn by AI.</w:t>
             </w:r>
           </w:p>
           <w:p>
@@ -7167,7 +7167,7 @@
                 <w:sz w:val="17"/>
                 <w:szCs w:val="17"/>
               </w:rPr>
-              <w:t xml:space="preserve">Rango cronológico: Variabilidad natural de inicio entre los 9 y 15 años</w:t>
+              <w:t xml:space="preserve">Rango cronológico: Variabilidad natural de inicio entre los 10 y 16 años</w:t>
             </w:r>
           </w:p>
         </w:tc>
@@ -7188,7 +7188,7 @@
                 <w:sz w:val="18"/>
                 <w:szCs w:val="18"/>
               </w:rPr>
-              <w:t xml:space="preserve">No todos los cuerpos crecen al mismo tiempo. La pubertad tiene un ritmo único para cada individuo y todas las trayectorias son normales y saludables.</w:t>
+              <w:t xml:space="preserve">No todos los cuerpos crecen al mismo tiempo. La pubertad inicia normalmente entre los 10 y 16 años según ritmos genéticos.</w:t>
             </w:r>
           </w:p>
         </w:tc>
@@ -7240,7 +7240,7 @@
                 <w:sz w:val="17"/>
                 <w:szCs w:val="17"/>
               </w:rPr>
-              <w:t xml:space="preserve">Duración asignada: 9 s</w:t>
+              <w:t xml:space="preserve">Duración asignada: 8 s</w:t>
             </w:r>
           </w:p>
         </w:tc>
@@ -7320,7 +7320,7 @@
                 <w:sz w:val="17"/>
                 <w:szCs w:val="17"/>
               </w:rPr>
-              <w:t xml:space="preserve">Modern anime style. The girl and boy ready to classify developmental traits with their science notebooks open. StudioSimple badge in corner. No text drawn by AI.</w:t>
+              <w:t xml:space="preserve">Modern anime style 16:9 widescreen illustration. Two 13-year-old student explorers, a girl with braided hair and a boy in a teal jacket, ready to classify developmental traits with their science notebooks open beside a StudioSimple badge, with generous negative space for text overlays. No text drawn by AI.</w:t>
             </w:r>
           </w:p>
           <w:p>
@@ -7363,7 +7363,7 @@
                 <w:sz w:val="18"/>
                 <w:szCs w:val="18"/>
               </w:rPr>
-              <w:t xml:space="preserve">Surge ahora el gran desafío: al analizar un cambio concreto en la pubertad, ¿cómo determinamos si es primario o secundario sin dudar?</w:t>
+              <w:t xml:space="preserve">Surge ahora el desafío: al analizar un cambio puberal, ¿cómo determinamos si es primario o secundario sin dudar?</w:t>
             </w:r>
           </w:p>
         </w:tc>
@@ -7836,7 +7836,7 @@
                 <w:sz w:val="17"/>
                 <w:szCs w:val="17"/>
               </w:rPr>
-              <w:t xml:space="preserve">Duración asignada: 11 s</w:t>
+              <w:t xml:space="preserve">Duración asignada: 12 s</w:t>
             </w:r>
           </w:p>
         </w:tc>
@@ -7916,7 +7916,7 @@
                 <w:sz w:val="17"/>
                 <w:szCs w:val="17"/>
               </w:rPr>
-              <w:t xml:space="preserve">Modern anime style 16:9. The boy and girl standing before a clear two-column digital panel titled 'Caracteres Primarios' and 'Caracteres Secundarios'. Clean scientific typography. No text drawn by AI.</w:t>
+              <w:t xml:space="preserve">Modern anime style 16:9 widescreen illustration. Two 13-year-old student explorers, a girl with braided hair and a boy in a teal jacket, standing before a clear two-column digital panel contrasting primary and secondary sexual characteristics, with generous negative space for text overlays. No text drawn by AI.</w:t>
             </w:r>
           </w:p>
           <w:p>
@@ -7959,7 +7959,7 @@
                 <w:sz w:val="18"/>
                 <w:szCs w:val="18"/>
               </w:rPr>
-              <w:t xml:space="preserve">El objetivo de hoy es diferenciar con precisión científica los caracteres sexuales primarios de los secundarios, comprendiendo la acción del sistema endocrino en la pubertad.</w:t>
+              <w:t xml:space="preserve">El objetivo de la lección es diferenciar con precisión científica los caracteres sexuales primarios de los secundarios, comprendiendo la acción del sistema endocrino en la pubertad.</w:t>
             </w:r>
           </w:p>
         </w:tc>
@@ -8011,7 +8011,7 @@
                 <w:sz w:val="17"/>
                 <w:szCs w:val="17"/>
               </w:rPr>
-              <w:t xml:space="preserve">Duración asignada: 12 s</w:t>
+              <w:t xml:space="preserve">Duración asignada: 11 s</w:t>
             </w:r>
           </w:p>
         </w:tc>
@@ -8091,7 +8091,7 @@
                 <w:sz w:val="17"/>
                 <w:szCs w:val="17"/>
               </w:rPr>
-              <w:t xml:space="preserve">Modern anime style. Detailed scientific illustration of the endocrine feedback loop: pituitary gland releasing FSH and LH to stimulate ovaries and testes. Crisp lines. No text drawn by AI.</w:t>
+              <w:t xml:space="preserve">Modern anime style 16:9 widescreen illustration. Two 13-year-old student explorers, a girl with braided hair and a boy in a teal jacket, analyzing the endocrine feedback loop showing the pituitary gland, gonadotropins, and gonadal hormones, with generous negative space for text overlays. No text drawn by AI.</w:t>
             </w:r>
           </w:p>
           <w:p>
@@ -8134,7 +8134,7 @@
                 <w:sz w:val="18"/>
                 <w:szCs w:val="18"/>
               </w:rPr>
-              <w:t xml:space="preserve">La pubertad inicia cuando la hipófisis secreta hormonas gonadales. Estas estimulan la producción de estrógenos en mujeres y testosterona en varones, desencadenando los cambios físicos.</w:t>
+              <w:t xml:space="preserve">La pubertad inicia cuando la hipófisis secreta hormonas gonadales. Estas estimulan la producción de estrógenos en mujeres y testosterona en varones, desencadenando cambios físicos.</w:t>
             </w:r>
           </w:p>
         </w:tc>
@@ -8186,7 +8186,7 @@
                 <w:sz w:val="17"/>
                 <w:szCs w:val="17"/>
               </w:rPr>
-              <w:t xml:space="preserve">Duración asignada: 12 s</w:t>
+              <w:t xml:space="preserve">Duración asignada: 11 s</w:t>
             </w:r>
           </w:p>
         </w:tc>
@@ -8266,7 +8266,7 @@
                 <w:sz w:val="17"/>
                 <w:szCs w:val="17"/>
               </w:rPr>
-              <w:t xml:space="preserve">Modern anime style. Clear medical chart highlighting the internal and external reproductive anatomy present since birth. Respectful scientific design. No text drawn by AI.</w:t>
+              <w:t xml:space="preserve">Modern anime style 16:9 widescreen illustration. Two 13-year-old student explorers, a girl with braided hair and a boy in a teal jacket, examining a developmental timeline of secondary sexual characteristics in males and females with clean medical aesthetics, with generous negative space for text overlays. No text drawn by AI.</w:t>
             </w:r>
           </w:p>
           <w:p>
@@ -8309,7 +8309,7 @@
                 <w:sz w:val="18"/>
                 <w:szCs w:val="18"/>
               </w:rPr>
-              <w:t xml:space="preserve">Los caracteres primarios son los órganos reproductores anatómicos con los que nace cada ser humano. Su estructura se define durante la etapa embrionaria previa al nacimiento.</w:t>
+              <w:t xml:space="preserve">Los caracteres primarios son congénitos y anatómicos. Los secundarios son adquiridos durante la pubertad por estímulo hormonal, preparando al organismo para la madurez reproductiva.</w:t>
             </w:r>
           </w:p>
         </w:tc>
@@ -8361,7 +8361,7 @@
                 <w:sz w:val="17"/>
                 <w:szCs w:val="17"/>
               </w:rPr>
-              <w:t xml:space="preserve">Duración asignada: 11 s</w:t>
+              <w:t xml:space="preserve">Duración asignada: 14 s</w:t>
             </w:r>
           </w:p>
         </w:tc>
@@ -8441,7 +8441,7 @@
                 <w:sz w:val="17"/>
                 <w:szCs w:val="17"/>
               </w:rPr>
-              <w:t xml:space="preserve">Modern anime style. Illustrated adolescent developmental landmarks: growth spurt, larynx enlargement, shoulder broadening, and body hair growth. Clean lineart. No text drawn by AI.</w:t>
+              <w:t xml:space="preserve">Modern anime style 16:9 widescreen illustration. Two 13-year-old student explorers, a girl with braided hair and a boy in a teal jacket, comparing growth curves and percentiles in their notebooks, laughing warmly with reassurance about individual rhythms, with generous negative space for text overlays. No text drawn by AI.</w:t>
             </w:r>
           </w:p>
           <w:p>
@@ -8484,7 +8484,7 @@
                 <w:sz w:val="18"/>
                 <w:szCs w:val="18"/>
               </w:rPr>
-              <w:t xml:space="preserve">Los caracteres secundarios son las transformaciones corporales que aparecen en la pubertad: aceleración del crecimiento, modificación de la voz, desarrollo mamario y distribución de vello.</w:t>
+              <w:t xml:space="preserve">El ritmo de crecimiento varía entre personas. El estirón y la maduración ocurren entre los 10 y 16 años sin que existan diferencias de valor entre ritmos rápidos o lentos.</w:t>
             </w:r>
           </w:p>
         </w:tc>
@@ -8616,7 +8616,7 @@
                 <w:sz w:val="17"/>
                 <w:szCs w:val="17"/>
               </w:rPr>
-              <w:t xml:space="preserve">Modern anime style. The boy and girl dialoguing openly with a supportive mentor or family member in a warm room. Welcoming atmosphere. No text drawn by AI.</w:t>
+              <w:t xml:space="preserve">Modern anime style 16:9 widescreen illustration. Two 13-year-old student explorers, a girl with braided hair and a boy in a teal jacket, writing in their science journals while a supportive family chats in the background living room, with generous negative space for text overlays. No text drawn by AI.</w:t>
             </w:r>
           </w:p>
           <w:p>
@@ -8711,7 +8711,7 @@
                 <w:sz w:val="17"/>
                 <w:szCs w:val="17"/>
               </w:rPr>
-              <w:t xml:space="preserve">Duración asignada: 22 s</w:t>
+              <w:t xml:space="preserve">Duración asignada: 24 s</w:t>
             </w:r>
           </w:p>
         </w:tc>
@@ -8791,7 +8791,7 @@
                 <w:sz w:val="17"/>
                 <w:szCs w:val="17"/>
               </w:rPr>
-              <w:t xml:space="preserve">Modern anime style 16:9. The boy and girl analyzing an illustrated medical card with height metrics and voice frequency charts on their desk. High clarity. No text drawn by AI.</w:t>
+              <w:t xml:space="preserve">Modern anime style 16:9 widescreen illustration. Two 13-year-old student explorers, a girl with braided hair and a boy in a teal jacket, analyzing an illustrated medical card with height metrics and voice frequency charts on their desk, with generous negative space for text overlays. No text drawn by AI.</w:t>
             </w:r>
           </w:p>
           <w:p>
@@ -8886,7 +8886,7 @@
                 <w:sz w:val="17"/>
                 <w:szCs w:val="17"/>
               </w:rPr>
-              <w:t xml:space="preserve">Duración asignada: 12 s</w:t>
+              <w:t xml:space="preserve">Duración asignada: 15 s</w:t>
             </w:r>
           </w:p>
         </w:tc>
@@ -8966,7 +8966,7 @@
                 <w:sz w:val="17"/>
                 <w:szCs w:val="17"/>
               </w:rPr>
-              <w:t xml:space="preserve">Modern anime style. StudioSimple emblem with a clear two-part balance diagram: 'Nacimiento = Primarios' y 'Pubertad = Secundarios'. Clean solid colors. No text drawn by AI.</w:t>
+              <w:t xml:space="preserve">Modern anime style 16:9 widescreen illustration. Two 13-year-old student explorers, a girl with braided hair and a boy in a teal jacket, presenting a two-part diagram contrasting primary organs from birth with pubertal secondary traits beside a StudioSimple emblem, with generous negative space for text overlays. No text drawn by AI.</w:t>
             </w:r>
           </w:p>
           <w:p>
@@ -9009,7 +9009,7 @@
                 <w:sz w:val="18"/>
                 <w:szCs w:val="18"/>
               </w:rPr>
-              <w:t xml:space="preserve">Recuerda la regla de oro: los caracteres primarios nacen con nosotros; los secundarios despiertan en la pubertad por acción hormonal. ¡Ahora demostraremos lo aprendido en las actividades de la plataforma!</w:t>
+              <w:t xml:space="preserve">Recuerda la regla de oro: los caracteres primarios nacen con nosotros; los secundarios despiertan en la pubertad por acción hormonal. ¡Ahora pon a prueba lo aprendido resolviendo las actividades prácticas en la plataforma interactiva!</w:t>
             </w:r>
           </w:p>
         </w:tc>
@@ -9037,10 +9037,10 @@
           <w:b/>
           <w:bCs/>
         </w:rPr>
-        <w:t xml:space="preserve">Comprobación 1 (Justificación de caracteres secundarios): </w:t>
-      </w:r>
-      <w:r>
-        <w:t xml:space="preserve">Si alguien afirma que el desarrollo mamario y la aparición de barba son caracteres primarios, ¿cómo corregirías esa afirmación con base científica?</w:t>
+        <w:t xml:space="preserve">Comprobación 1 (Caso 1: Clasificación de caracteres físicos): </w:t>
+      </w:r>
+      <w:r>
+        <w:t xml:space="preserve">Identifica si el cambio en el tono de la voz y el aumento acelerado de estatura corresponden a caracteres sexuales primarios o secundarios, y justifica tu respuesta con un criterio biológico.</w:t>
       </w:r>
     </w:p>
     <w:p>
@@ -9056,7 +9056,7 @@
         <w:t xml:space="preserve">• Respuesta esperada: </w:t>
       </w:r>
       <w:r>
-        <w:t xml:space="preserve">Explicando que son secundarios porque aparecen en la pubertad por acción de las hormonas, mientras que los primarios son los órganos genitales que ya están presentes al nacer.</w:t>
+        <w:t xml:space="preserve">Corresponden a caracteres sexuales secundarios, porque se desarrollan durante la pubertad por acción de las hormonas sexuales y no están presentes desde el nacimiento.</w:t>
       </w:r>
       <w:r>
         <w:rPr>
@@ -9067,7 +9067,7 @@
         <w:t xml:space="preserve"> | Pista socrática: </w:t>
       </w:r>
       <w:r>
-        <w:t xml:space="preserve">Recuerda la regla de oro: ¿estos rasgos físicos existen en un recién nacido o se desarrollan en la pubertad?</w:t>
+        <w:t xml:space="preserve">Aplica la regla de oro: ¿un recién nacido ya tiene voz grave o estirón de estatura, o se manifiestan en la pubertad?</w:t>
       </w:r>
     </w:p>
     <w:p>
@@ -9083,7 +9083,7 @@
         <w:t xml:space="preserve">• Texto revelado al estudiante: </w:t>
       </w:r>
       <w:r>
-        <w:t xml:space="preserve">Son secundarios porque aparecen en la pubertad y no desde el nacimiento.</w:t>
+        <w:t xml:space="preserve">Caracteres secundarios, porque aparecen en la pubertad por acción de las hormonas sexuales.</w:t>
       </w:r>
     </w:p>
     <w:p>
@@ -9095,10 +9095,10 @@
           <w:b/>
           <w:bCs/>
         </w:rPr>
-        <w:t xml:space="preserve">Comprobación 2 (Manejo saludable de las emociones): </w:t>
-      </w:r>
-      <w:r>
-        <w:t xml:space="preserve">¿Por qué es importante que los adolescentes mantengan una comunicación abierta con sus familias durante los cambios puberales?</w:t>
+        <w:t xml:space="preserve">Comprobación 2 (Caso 2: Cambios emocionales y autonomía): </w:t>
+      </w:r>
+      <w:r>
+        <w:t xml:space="preserve">Un estudiante de 13 años siente que a veces prefiere estar a solas reflexionando y otras veces necesita el apoyo de sus padres. ¿Es esta conducta un cambio emocional normal de la pubertad? Justifica.</w:t>
       </w:r>
     </w:p>
     <w:p>
@@ -9114,7 +9114,7 @@
         <w:t xml:space="preserve">• Respuesta esperada: </w:t>
       </w:r>
       <w:r>
-        <w:t xml:space="preserve">Porque ayuda a comprender que los cambios físicos y emocionales son naturales, alivia temores y fortalece la confianza familiar.</w:t>
+        <w:t xml:space="preserve">Sí, es completamente normal, ya que la pubertad involucra la búsqueda de autonomía e identidad personal junto con la necesidad de seguridad afectiva.</w:t>
       </w:r>
       <w:r>
         <w:rPr>
@@ -9125,7 +9125,7 @@
         <w:t xml:space="preserve"> | Pista socrática: </w:t>
       </w:r>
       <w:r>
-        <w:t xml:space="preserve">Piensa en el beneficio de conversar con adultos de confianza cuando surgen dudas sobre el propio cuerpo.</w:t>
+        <w:t xml:space="preserve">Piensa en lo analizado sobre la dimensión emocional: ¿la búsqueda de independencia es parte del crecimiento?</w:t>
       </w:r>
     </w:p>
     <w:p>
@@ -9141,7 +9141,7 @@
         <w:t xml:space="preserve">• Texto revelado al estudiante: </w:t>
       </w:r>
       <w:r>
-        <w:t xml:space="preserve">Porque brinda confianza, calma las dudas y enseña que los cambios son normales.</w:t>
+        <w:t xml:space="preserve">Sí, es normal porque en la pubertad se busca autonomía e identidad personal.</w:t>
       </w:r>
     </w:p>
     <w:p>
@@ -9675,7 +9675,7 @@
           <w:i/>
           <w:iCs/>
         </w:rPr>
-        <w:t xml:space="preserve">Existe una amplia variabilidad biológica natural: la pubertad suele iniciarse entre los 9 y 15 años sin que ello represente una anomalía.</w:t>
+        <w:t xml:space="preserve">Existe una amplia variabilidad biológica natural: la pubertad suele iniciarse entre los 10 y 16 años sin que ello represente una anomalía.</w:t>
       </w:r>
     </w:p>
     <w:p>
@@ -11058,7 +11058,7 @@
                 <w:sz w:val="17"/>
                 <w:szCs w:val="17"/>
               </w:rPr>
-              <w:t xml:space="preserve">Duración asignada: 9 s</w:t>
+              <w:t xml:space="preserve">Duración asignada: 10 s</w:t>
             </w:r>
           </w:p>
         </w:tc>
@@ -11138,7 +11138,7 @@
                 <w:sz w:val="17"/>
                 <w:szCs w:val="17"/>
               </w:rPr>
-              <w:t xml:space="preserve">Modern anime style 16:9 widescreen illustration. Two 13-year-old student explorers, a girl with braided hair and a boy in a teal jacket, sharing a peaceful conversation on a wooden bench in a sunlit school courtyard. Warm morning light, clean negative space in upper third. No text drawn by AI.</w:t>
+              <w:t xml:space="preserve">Modern anime style 16:9 widescreen illustration. Two 13-year-old student explorers, a girl with braided hair and a boy in a teal jacket, sharing a peaceful conversation on a wooden bench in a sunlit courtyard, learning the value of empathy and friendship, with generous negative space for text overlays. No text drawn by AI.</w:t>
             </w:r>
           </w:p>
           <w:p>
@@ -11313,7 +11313,7 @@
                 <w:sz w:val="17"/>
                 <w:szCs w:val="17"/>
               </w:rPr>
-              <w:t xml:space="preserve">Modern anime style. Close-up of the two young students listening attentively to each other, soft glowing emblem of a heart connecting with an open ear. Clean lines. No text drawn by AI.</w:t>
+              <w:t xml:space="preserve">Modern anime style 16:9 widescreen illustration. Two 13-year-old student explorers, a girl with braided hair and a boy in a teal jacket, resolving a misunderstanding calmly under a courtyard pergola with active listening gestures and mutual respect, with generous negative space for text overlays. No text drawn by AI.</w:t>
             </w:r>
           </w:p>
           <w:p>
@@ -11356,7 +11356,7 @@
                 <w:sz w:val="18"/>
                 <w:szCs w:val="18"/>
               </w:rPr>
-              <w:t xml:space="preserve">La empatía consiste en ponerse en el lugar del otro. Escuchar con atención sincera permite entender lo que siente nuestro amigo antes de responder.</w:t>
+              <w:t xml:space="preserve">En la adolescencia, las amistades cobran un valor central. Aprendemos a compartir vivencias, escuchar con paciencia y brindar apoyo sincero.</w:t>
             </w:r>
           </w:p>
         </w:tc>
@@ -11488,7 +11488,7 @@
                 <w:sz w:val="17"/>
                 <w:szCs w:val="17"/>
               </w:rPr>
-              <w:t xml:space="preserve">Modern anime style. The two companions collaborating harmoniously on a science model, smiling and sharing tools with natural ease. Balanced lighting. No text drawn by AI.</w:t>
+              <w:t xml:space="preserve">Modern anime style 16:9 widescreen illustration. Two 13-year-old student explorers, a girl with braided hair and a boy in a teal jacket, visualizing two thought bubbles overlapping in gentle harmony representing empathy and reciprocal perspective, with generous negative space for text overlays. No text drawn by AI.</w:t>
             </w:r>
           </w:p>
           <w:p>
@@ -11531,7 +11531,7 @@
                 <w:sz w:val="18"/>
                 <w:szCs w:val="18"/>
               </w:rPr>
-              <w:t xml:space="preserve">Una relación afectiva saludable es recíproca. Ambas partes entregan cuidado, valoran las ideas del otro y no intentan imponer sus gustos por la fuerza.</w:t>
+              <w:t xml:space="preserve">La empatía es la capacidad de ponerse en el lugar del otro, comprendiendo sus emociones y respetando sus puntos de vista sin juzgar.</w:t>
             </w:r>
           </w:p>
         </w:tc>
@@ -11583,7 +11583,7 @@
                 <w:sz w:val="17"/>
                 <w:szCs w:val="17"/>
               </w:rPr>
-              <w:t xml:space="preserve">Duración asignada: 9 s</w:t>
+              <w:t xml:space="preserve">Duración asignada: 10 s</w:t>
             </w:r>
           </w:p>
         </w:tc>
@@ -11663,7 +11663,7 @@
                 <w:sz w:val="17"/>
                 <w:szCs w:val="17"/>
               </w:rPr>
-              <w:t xml:space="preserve">Modern anime style. Illustrated sanctuary icon with an open notebook and an illuminated privacy lock symbol surrounded by soft garden greenery. No text drawn by AI.</w:t>
+              <w:t xml:space="preserve">Modern anime style 16:9 widescreen illustration. Two 13-year-old student explorers, a girl with braided hair and a boy in a teal jacket, holding a symbolic glowing blue emblem representing personal boundaries, intimacy, and family privacy, with generous negative space for text overlays. No text drawn by AI.</w:t>
             </w:r>
           </w:p>
           <w:p>
@@ -11706,7 +11706,7 @@
                 <w:sz w:val="18"/>
                 <w:szCs w:val="18"/>
               </w:rPr>
-              <w:t xml:space="preserve">La intimidad es nuestro espacio personal más íntimo. Reúne nuestros pensamientos y vivencias que compartimos solo cuando nos sentimos seguros y en plena confianza.</w:t>
+              <w:t xml:space="preserve">La intimidad es nuestro espacio personal más reservado. Cada persona tiene derecho a decidir qué comparte y qué guarda para sí misma.</w:t>
             </w:r>
           </w:p>
         </w:tc>
@@ -11758,7 +11758,7 @@
                 <w:sz w:val="17"/>
                 <w:szCs w:val="17"/>
               </w:rPr>
-              <w:t xml:space="preserve">Duración asignada: 9 s</w:t>
+              <w:t xml:space="preserve">Duración asignada: 10 s</w:t>
             </w:r>
           </w:p>
         </w:tc>
@@ -11838,7 +11838,7 @@
                 <w:sz w:val="17"/>
                 <w:szCs w:val="17"/>
               </w:rPr>
-              <w:t xml:space="preserve">Modern anime style. The two adolescents using a tablet thoughtfully, displaying a glowing shield icon of digital privacy protection. Clean composition. No text drawn by AI.</w:t>
+              <w:t xml:space="preserve">Modern anime style 16:9 widescreen illustration. Two 13-year-old student explorers, a girl with braided hair and a boy in a teal jacket, reflecting on reciprocal support and sharing notes during study time in a soft morning atmosphere, with generous negative space for text overlays. No text drawn by AI.</w:t>
             </w:r>
           </w:p>
           <w:p>
@@ -11881,7 +11881,7 @@
                 <w:sz w:val="18"/>
                 <w:szCs w:val="18"/>
               </w:rPr>
-              <w:t xml:space="preserve">En el mundo digital, cuidar la intimidad es prioritario. Nunca debemos difundir fotos o mensajes privados de otros sin su autorización expresa e informada.</w:t>
+              <w:t xml:space="preserve">La reciprocidad exige equilibrio: dar y recibir afecto en igualdad de condiciones, cuidando que nadie imponga su voluntad sobre los demás.</w:t>
             </w:r>
           </w:p>
         </w:tc>
@@ -11933,7 +11933,7 @@
                 <w:sz w:val="17"/>
                 <w:szCs w:val="17"/>
               </w:rPr>
-              <w:t xml:space="preserve">Duración asignada: 9 s</w:t>
+              <w:t xml:space="preserve">Duración asignada: 10 s</w:t>
             </w:r>
           </w:p>
         </w:tc>
@@ -12013,7 +12013,7 @@
                 <w:sz w:val="17"/>
                 <w:szCs w:val="17"/>
               </w:rPr>
-              <w:t xml:space="preserve">Modern anime style. Warm living room scene where the adolescent characters talk smilingly with loving parents while drinking hot cocoa. Atmospheric golden hour. No text drawn by AI.</w:t>
+              <w:t xml:space="preserve">Modern anime style 16:9 widescreen illustration. Two 13-year-old student explorers, a girl with braided hair and a boy in a teal jacket, agreeing on respectful group rules with classmates in a bright school library with thumbs-up gestures, with generous negative space for text overlays. No text drawn by AI.</w:t>
             </w:r>
           </w:p>
           <w:p>
@@ -12056,7 +12056,7 @@
                 <w:sz w:val="18"/>
                 <w:szCs w:val="18"/>
               </w:rPr>
-              <w:t xml:space="preserve">La familia representa el primer espacio de intimidad y afecto. Compartir dudas con honestidad fortalece la autoestima y brinda tranquilidad en momentos de cambio.</w:t>
+              <w:t xml:space="preserve">Cuando surge un desacuerdo con amigos o familia, el diálogo sincero y la calma permiten encontrar acuerdos justos que cuiden la relación.</w:t>
             </w:r>
           </w:p>
         </w:tc>
@@ -12188,7 +12188,7 @@
                 <w:sz w:val="17"/>
                 <w:szCs w:val="17"/>
               </w:rPr>
-              <w:t xml:space="preserve">Modern anime style. Both explorers looking towards the viewer with empathy and resolve, holding their notebooks ready. StudioSimple logo. No text drawn by AI.</w:t>
+              <w:t xml:space="preserve">Modern anime style 16:9 widescreen illustration. Two 13-year-old student explorers, a girl with braided hair and a boy in a teal jacket, holding open science notebooks, ready to investigate interpersonal cases beside a StudioSimple badge, with generous negative space for text overlays. No text drawn by AI.</w:t>
             </w:r>
           </w:p>
           <w:p>
@@ -12231,7 +12231,7 @@
                 <w:sz w:val="18"/>
                 <w:szCs w:val="18"/>
               </w:rPr>
-              <w:t xml:space="preserve">Surge ahora el gran desafío: cuando dos personas enfrentan un desacuerdo, ¿qué principios afectivos y éticos permiten resolverlo con respeto y serenidad?</w:t>
+              <w:t xml:space="preserve">Surge ahora la pregunta: en nuestras relaciones diarias, ¿cómo podemos cuidar la intimidad ajena y expresar afecto con madurez?</w:t>
             </w:r>
           </w:p>
         </w:tc>
@@ -12704,7 +12704,7 @@
                 <w:sz w:val="17"/>
                 <w:szCs w:val="17"/>
               </w:rPr>
-              <w:t xml:space="preserve">Duración asignada: 12 s</w:t>
+              <w:t xml:space="preserve">Duración asignada: 11 s</w:t>
             </w:r>
           </w:p>
         </w:tc>
@@ -12784,7 +12784,7 @@
                 <w:sz w:val="17"/>
                 <w:szCs w:val="17"/>
               </w:rPr>
-              <w:t xml:space="preserve">Modern anime style 16:9. The boy and girl standing before an elegant triangular diagram: 'Empatía', 'Reciprocidad' y 'Respeto a la Intimidad'. Clear typography. No text drawn by AI.</w:t>
+              <w:t xml:space="preserve">Modern anime style 16:9 widescreen illustration. Two 13-year-old student explorers, a girl with braided hair and a boy in a teal jacket, standing next to a glowing infographic illustrating empathy, mutual trust, and personal intimacy, with generous negative space for text overlays. No text drawn by AI.</w:t>
             </w:r>
           </w:p>
           <w:p>
@@ -12827,7 +12827,7 @@
                 <w:sz w:val="18"/>
                 <w:szCs w:val="18"/>
               </w:rPr>
-              <w:t xml:space="preserve">El objetivo de hoy es explicar el rol fundamental de la reciprocidad, la empatía y el respeto a la intimidad personal en la construcción de vínculos afectivos saludables.</w:t>
+              <w:t xml:space="preserve">El objetivo de la lección es comprender el valor de la empatía, el respeto mutuo y la intimidad en los vínculos afectivos de la adolescencia.</w:t>
             </w:r>
           </w:p>
         </w:tc>
@@ -12959,7 +12959,7 @@
                 <w:sz w:val="17"/>
                 <w:szCs w:val="17"/>
               </w:rPr>
-              <w:t xml:space="preserve">Modern anime style. Illustration of an emotional resonance bridge between two adolescents talking calmly under soft sunlight. Clean lineart. No text drawn by AI.</w:t>
+              <w:t xml:space="preserve">Modern anime style 16:9 widescreen illustration. Two 13-year-old student explorers, a girl with braided hair and a boy in a teal jacket, listening intently to each other with speech bubbles transforming into a bridge of reciprocal understanding, with generous negative space for text overlays. No text drawn by AI.</w:t>
             </w:r>
           </w:p>
           <w:p>
@@ -13002,7 +13002,7 @@
                 <w:sz w:val="18"/>
                 <w:szCs w:val="18"/>
               </w:rPr>
-              <w:t xml:space="preserve">La empatía es la capacidad de percibir y comprender el estado emocional del otro. Favorece la solidaridad, fortalece el apego seguro y previene la violencia en la convivencia.</w:t>
+              <w:t xml:space="preserve">Los vínculos afectivos sanos se construyen sobre la reciprocidad y la confianza. Cuando ambas partes se sienten escuchadas y valoradas, la amistad se fortalece y genera bienestar.</w:t>
             </w:r>
           </w:p>
         </w:tc>
@@ -13054,7 +13054,7 @@
                 <w:sz w:val="17"/>
                 <w:szCs w:val="17"/>
               </w:rPr>
-              <w:t xml:space="preserve">Duración asignada: 12 s</w:t>
+              <w:t xml:space="preserve">Duración asignada: 13 s</w:t>
             </w:r>
           </w:p>
         </w:tc>
@@ -13134,7 +13134,7 @@
                 <w:sz w:val="17"/>
                 <w:szCs w:val="17"/>
               </w:rPr>
-              <w:t xml:space="preserve">Modern anime style. Two hands exchanging a puzzle piece of friendship with care and gentleness. Warm ambient glow. No text drawn by AI.</w:t>
+              <w:t xml:space="preserve">Modern anime style 16:9 widescreen illustration. Two 13-year-old student explorers, a girl with braided hair and a boy in a teal jacket, keeping personal confidences safe beside a study desk with a glowing lock and diary emblem, with generous negative space for text overlays. No text drawn by AI.</w:t>
             </w:r>
           </w:p>
           <w:p>
@@ -13177,7 +13177,7 @@
                 <w:sz w:val="18"/>
                 <w:szCs w:val="18"/>
               </w:rPr>
-              <w:t xml:space="preserve">La reciprocidad garantiza que ambas personas se sientan valoradas por igual. Las relaciones sanas no admiten manipulaciones, exigencias desmedidas ni relaciones de poder asimétricas.</w:t>
+              <w:t xml:space="preserve">La empatía permite conectar con los sentimientos ajenos sin invalidarlos. Escuchar activamente a un amigo que pasa por un momento difícil es una manifestación concreta de madurez afectiva.</w:t>
             </w:r>
           </w:p>
         </w:tc>
@@ -13229,7 +13229,7 @@
                 <w:sz w:val="17"/>
                 <w:szCs w:val="17"/>
               </w:rPr>
-              <w:t xml:space="preserve">Duración asignada: 12 s</w:t>
+              <w:t xml:space="preserve">Duración asignada: 13 s</w:t>
             </w:r>
           </w:p>
         </w:tc>
@@ -13309,7 +13309,7 @@
                 <w:sz w:val="17"/>
                 <w:szCs w:val="17"/>
               </w:rPr>
-              <w:t xml:space="preserve">Modern anime style. The girl writing in a personal diary at her desk, with a soft protective glowing aura around her thoughts. Atmospheric peace. No text drawn by AI.</w:t>
+              <w:t xml:space="preserve">Modern anime style 16:9 widescreen illustration. Two 13-year-old student explorers, a girl with braided hair and a boy in a teal jacket, observing a balanced scale of reciprocal care and mutual respect glowing softly in cyan and gold, with generous negative space for text overlays. No text drawn by AI.</w:t>
             </w:r>
           </w:p>
           <w:p>
@@ -13352,7 +13352,7 @@
                 <w:sz w:val="18"/>
                 <w:szCs w:val="18"/>
               </w:rPr>
-              <w:t xml:space="preserve">La intimidad comprende la privacidad de nuestro cuerpo, pensamientos y afectos. Respetar la intimidad ajena implica no invadir espacios privados ni forzar confesiones o contactos.</w:t>
+              <w:t xml:space="preserve">El respeto a la intimidad exige no divulgar confidencias, no revisar pertenencias ajenas y no presionar a nadie para que revele aspectos reservados de su vida personal o familiar.</w:t>
             </w:r>
           </w:p>
         </w:tc>
@@ -13404,7 +13404,7 @@
                 <w:sz w:val="17"/>
                 <w:szCs w:val="17"/>
               </w:rPr>
-              <w:t xml:space="preserve">Duración asignada: 12 s</w:t>
+              <w:t xml:space="preserve">Duración asignada: 11 s</w:t>
             </w:r>
           </w:p>
         </w:tc>
@@ -13484,7 +13484,7 @@
                 <w:sz w:val="17"/>
                 <w:szCs w:val="17"/>
               </w:rPr>
-              <w:t xml:space="preserve">Modern anime style. Smartphone interface showing respectful chat bubbles and privacy lock shields in cyan and white. Clean modern UI aesthetic. No text drawn by AI.</w:t>
+              <w:t xml:space="preserve">Modern anime style 16:9 widescreen illustration. Two 13-year-old student explorers, a girl with braided hair and a boy in a teal jacket, high-fiving respectfully after establishing healthy teamwork boundaries and positive peer support, with generous negative space for text overlays. No text drawn by AI.</w:t>
             </w:r>
           </w:p>
           <w:p>
@@ -13527,7 +13527,7 @@
                 <w:sz w:val="18"/>
                 <w:szCs w:val="18"/>
               </w:rPr>
-              <w:t xml:space="preserve">El entorno digital exige el mismo rigor ético que el presencial. La divulgación de material íntimo sin consentimiento causa daño psicológico y vulnera los derechos fundamentales del adolescente.</w:t>
+              <w:t xml:space="preserve">La reciprocidad evita relaciones desiguales. Compartir decisiones en el grupo escolar garantiza que nadie se sienta excluido o sometido a las preferencias de los demás.</w:t>
             </w:r>
           </w:p>
         </w:tc>
@@ -13579,7 +13579,7 @@
                 <w:sz w:val="17"/>
                 <w:szCs w:val="17"/>
               </w:rPr>
-              <w:t xml:space="preserve">Duración asignada: 22 s</w:t>
+              <w:t xml:space="preserve">Duración asignada: 27 s</w:t>
             </w:r>
           </w:p>
         </w:tc>
@@ -13659,7 +13659,7 @@
                 <w:sz w:val="17"/>
                 <w:szCs w:val="17"/>
               </w:rPr>
-              <w:t xml:space="preserve">Modern anime style 16:9. The boy and girl collaborating over an organized project planner, smiling after finding a creative shared solution. High detail. No text drawn by AI.</w:t>
+              <w:t xml:space="preserve">Modern anime style 16:9 widescreen illustration. Two 13-year-old student explorers, a girl with braided hair and a boy in a teal jacket, examining an illustrated case card of respectful conflict resolution on a study desk, with generous negative space for text overlays. No text drawn by AI.</w:t>
             </w:r>
           </w:p>
           <w:p>
@@ -13702,7 +13702,7 @@
                 <w:sz w:val="18"/>
                 <w:szCs w:val="18"/>
               </w:rPr>
-              <w:t xml:space="preserve">Analicemos un caso concreto: dos amigos debaten sobre cómo resolver una diferencia de opinión sobre un proyecto escolar sin presiones, aplicando diálogo sincero y respeto mutuo. ¿Qué principio afectivo y ético se aplica? Se aplica la comunicación empática y la reciprocidad, escuchando la postura del otro y buscando acuerdos sin forzar la voluntad de nadie.</w:t>
+              <w:t xml:space="preserve">Analicemos un caso concreto: dos amigos debaten sobre cómo resolver una diferencia de opinión sobre un proyecto escolar sin presiones, aplicando diálogo sincero y respeto mutuo. ¿Qué principio afectivo y ético se aplica? Se aplica la comunicación empática y la reciprocidad, ya que ambos escuchan con respeto la postura del otro y construyen un acuerdo justo sin forzar voluntades.</w:t>
             </w:r>
           </w:p>
         </w:tc>
@@ -13754,7 +13754,7 @@
                 <w:sz w:val="17"/>
                 <w:szCs w:val="17"/>
               </w:rPr>
-              <w:t xml:space="preserve">Duración asignada: 12 s</w:t>
+              <w:t xml:space="preserve">Duración asignada: 14 s</w:t>
             </w:r>
           </w:p>
         </w:tc>
@@ -13834,7 +13834,7 @@
                 <w:sz w:val="17"/>
                 <w:szCs w:val="17"/>
               </w:rPr>
-              <w:t xml:space="preserve">Modern anime style. StudioSimple emblem with an elegant tri-color emblem: 'Empatía + Reciprocidad + Intimidad = Vínculo Sano'. Crisp contrast. No text drawn by AI.</w:t>
+              <w:t xml:space="preserve">Modern anime style 16:9 widescreen illustration. Two 13-year-old student explorers, a girl with braided hair and a boy in a teal jacket, presenting a three-pillar diagram of empathy, reciprocity, and intimacy beside a StudioSimple emblem, with generous negative space for text overlays. No text drawn by AI.</w:t>
             </w:r>
           </w:p>
           <w:p>
@@ -13877,7 +13877,7 @@
                 <w:sz w:val="18"/>
                 <w:szCs w:val="18"/>
               </w:rPr>
-              <w:t xml:space="preserve">Recuerda la regla de oro: las relaciones sanas se construyen con empatía mutua, reciprocidad y respeto a la intimidad. ¡Ahora demostraremos lo aprendido en las actividades de la plataforma!</w:t>
+              <w:t xml:space="preserve">Recuerda la regla de oro: la reciprocidad y la empatía protegen la intimidad y fortalecen la amistad. ¡Ahora pon a prueba lo aprendido resolviendo las actividades prácticas en la plataforma interactiva!</w:t>
             </w:r>
           </w:p>
         </w:tc>
@@ -13905,10 +13905,10 @@
           <w:b/>
           <w:bCs/>
         </w:rPr>
-        <w:t xml:space="preserve">Comprobación 1 (Construcción de confianza mutua): </w:t>
-      </w:r>
-      <w:r>
-        <w:t xml:space="preserve">¿Por qué la reciprocidad y la empatía evitan que una relación de amistad se vuelva perjudicial o tóxica?</w:t>
+        <w:t xml:space="preserve">Comprobación 1 (Caso 1: Resolución dialogada de diferencias): </w:t>
+      </w:r>
+      <w:r>
+        <w:t xml:space="preserve">Dos amigos debaten sobre cómo resolver una diferencia de opinión sobre un proyecto escolar sin presiones, aplicando diálogo sincero y respeto mutuo. ¿Qué principio afectivo y ético se aplica en su conducta?</w:t>
       </w:r>
     </w:p>
     <w:p>
@@ -13924,7 +13924,7 @@
         <w:t xml:space="preserve">• Respuesta esperada: </w:t>
       </w:r>
       <w:r>
-        <w:t xml:space="preserve">Porque aseguran que ambas personas sean tratadas con igual dignidad, evitando que una domine a la otra o se aproveche de sus afectos.</w:t>
+        <w:t xml:space="preserve">Se aplica la comunicación empática y la reciprocidad, ya que ambos escuchan con respeto la postura del otro y construyen un acuerdo justo sin forzar voluntades.</w:t>
       </w:r>
       <w:r>
         <w:rPr>
@@ -13935,7 +13935,7 @@
         <w:t xml:space="preserve"> | Pista socrática: </w:t>
       </w:r>
       <w:r>
-        <w:t xml:space="preserve">Piensa en qué pasaría si solo uno de los amigos decide todo y el otro tiene que obedecer siempre. ¿Es eso sano?</w:t>
+        <w:t xml:space="preserve">Fíjate en las actitudes: escuchar con calma, no imponerse y buscar un acuerdo donde ambos ganen. ¿Qué principios representan?</w:t>
       </w:r>
     </w:p>
     <w:p>
@@ -13951,7 +13951,7 @@
         <w:t xml:space="preserve">• Texto revelado al estudiante: </w:t>
       </w:r>
       <w:r>
-        <w:t xml:space="preserve">Porque evitan que una persona se imponga sobre la otra y aseguran respeto para ambos.</w:t>
+        <w:t xml:space="preserve">Comunicación empática y reciprocidad: escuchan al otro y llegan a acuerdos justos.</w:t>
       </w:r>
     </w:p>
     <w:p>
@@ -13963,10 +13963,10 @@
           <w:b/>
           <w:bCs/>
         </w:rPr>
-        <w:t xml:space="preserve">Comprobación 2 (Límites claros en la amistad): </w:t>
-      </w:r>
-      <w:r>
-        <w:t xml:space="preserve">Si un amigo te pide que no le cuentes a nadie algo personal que le ocurrió, ¿qué valor afectivo y ético estás cuidando al guardar el secreto?</w:t>
+        <w:t xml:space="preserve">Comprobación 2 (Caso 2: Cuidado de la intimidad en redes sociales): </w:t>
+      </w:r>
+      <w:r>
+        <w:t xml:space="preserve">Un grupo de chat propone compartir capturas de pantalla de una conversación privada de una compañera para reírse de sus gustos. Una estudiante dice que eso no es correcto y se niega a participar. ¿Qué derecho y valor ético defiende?</w:t>
       </w:r>
     </w:p>
     <w:p>
@@ -13982,7 +13982,7 @@
         <w:t xml:space="preserve">• Respuesta esperada: </w:t>
       </w:r>
       <w:r>
-        <w:t xml:space="preserve">El valor de la lealtad, la confianza y el respeto a su intimidad personal.</w:t>
+        <w:t xml:space="preserve">Defiende el derecho a la intimidad y privacidad de su compañera, y demuestra valores de lealtad, empatía y respeto ético.</w:t>
       </w:r>
       <w:r>
         <w:rPr>
@@ -13993,7 +13993,7 @@
         <w:t xml:space="preserve"> | Pista socrática: </w:t>
       </w:r>
       <w:r>
-        <w:t xml:space="preserve">Piensa en el compromiso tácito de confianza que se establece al compartir un secreto personal.</w:t>
+        <w:t xml:space="preserve">Piensa en la privacidad de la persona afectada: ¿tenían permiso para difundir sus palabras?</w:t>
       </w:r>
     </w:p>
     <w:p>
@@ -14009,7 +14009,7 @@
         <w:t xml:space="preserve">• Texto revelado al estudiante: </w:t>
       </w:r>
       <w:r>
-        <w:t xml:space="preserve">La confianza, la lealtad y el respeto a su intimidad.</w:t>
+        <w:t xml:space="preserve">El derecho a la intimidad y privacidad, actuando con respeto y empatía hacia su compañera.</w:t>
       </w:r>
     </w:p>
     <w:p>
@@ -15926,7 +15926,7 @@
                 <w:sz w:val="17"/>
                 <w:szCs w:val="17"/>
               </w:rPr>
-              <w:t xml:space="preserve">Duración asignada: 9 s</w:t>
+              <w:t xml:space="preserve">Duración asignada: 10 s</w:t>
             </w:r>
           </w:p>
         </w:tc>
@@ -16006,7 +16006,7 @@
                 <w:sz w:val="17"/>
                 <w:szCs w:val="17"/>
               </w:rPr>
-              <w:t xml:space="preserve">Modern anime style 16:9 widescreen illustration. Two 13-year-old student explorers, a girl with braided hair and a boy in a teal jacket, standing at a crossroads of glowing illuminated paths in a serene landscape. Warm morning lighting, clean negative space in upper third. No text drawn by AI.</w:t>
+              <w:t xml:space="preserve">Modern anime style 16:9 widescreen illustration. Two 13-year-old student explorers, a girl with braided hair and a boy in a teal jacket, standing in front of a welcoming digital board displaying the four pillars of responsible consent and self-care, with generous negative space for text overlays. No text drawn by AI.</w:t>
             </w:r>
           </w:p>
           <w:p>
@@ -16049,7 +16049,7 @@
                 <w:sz w:val="18"/>
                 <w:szCs w:val="18"/>
               </w:rPr>
-              <w:t xml:space="preserve">Comienza una nueva expedición en ciencias. Crecer implica asumir la responsabilidad de cuidar nuestro propio cuerpo y tomar decisiones que protejan nuestra integridad.</w:t>
+              <w:t xml:space="preserve">Comienza una lección fundamental en ciencias. El autocuidado y la responsabilidad personal son herramientas que protegen nuestro bienestar físico, emocional y social.</w:t>
             </w:r>
           </w:p>
         </w:tc>
@@ -16101,7 +16101,7 @@
                 <w:sz w:val="17"/>
                 <w:szCs w:val="17"/>
               </w:rPr>
-              <w:t xml:space="preserve">Duración asignada: 10 s</w:t>
+              <w:t xml:space="preserve">Duración asignada: 9 s</w:t>
             </w:r>
           </w:p>
         </w:tc>
@@ -16181,7 +16181,7 @@
                 <w:sz w:val="17"/>
                 <w:szCs w:val="17"/>
               </w:rPr>
-              <w:t xml:space="preserve">Modern anime style. The two adolescent explorers with confident postures, surrounded by a subtle protective shield emblem of glowing cyan light. Clean composition. No text drawn by AI.</w:t>
+              <w:t xml:space="preserve">Modern anime style 16:9 widescreen illustration. Two 13-year-old student explorers, a girl with braided hair and a boy in a teal jacket, standing calmly in front of a study room with an open hand sign projecting serene confidence and clear personal boundaries, with generous negative space for text overlays. No text drawn by AI.</w:t>
             </w:r>
           </w:p>
           <w:p>
@@ -16224,7 +16224,7 @@
                 <w:sz w:val="18"/>
                 <w:szCs w:val="18"/>
               </w:rPr>
-              <w:t xml:space="preserve">Cada ser humano es el único dueño de su cuerpo. Nadie tiene derecho a tocarte, invadir tu privacidad o presionarte para realizar algo que no deseas.</w:t>
+              <w:t xml:space="preserve">El consentimiento es el acuerdo libre, consciente y voluntario mediante el cual una persona acepta participar en una situación determinada.</w:t>
             </w:r>
           </w:p>
         </w:tc>
@@ -16276,7 +16276,7 @@
                 <w:sz w:val="17"/>
                 <w:szCs w:val="17"/>
               </w:rPr>
-              <w:t xml:space="preserve">Duración asignada: 9 s</w:t>
+              <w:t xml:space="preserve">Duración asignada: 10 s</w:t>
             </w:r>
           </w:p>
         </w:tc>
@@ -16356,7 +16356,7 @@
                 <w:sz w:val="17"/>
                 <w:szCs w:val="17"/>
               </w:rPr>
-              <w:t xml:space="preserve">Modern anime style. Two open hands meeting with mutual respect and equality, glowing emblem of a green checkmark and clear boundaries. Warm balanced lighting. No text drawn by AI.</w:t>
+              <w:t xml:space="preserve">Modern anime style 16:9 widescreen illustration. Two 13-year-old student explorers, a girl with braided hair and a boy in a teal jacket, assembling four glowing holographic puzzle pieces representing free, informed, specific, and revocable consent, with generous negative space for text overlays. No text drawn by AI.</w:t>
             </w:r>
           </w:p>
           <w:p>
@@ -16399,7 +16399,7 @@
                 <w:sz w:val="18"/>
                 <w:szCs w:val="18"/>
               </w:rPr>
-              <w:t xml:space="preserve">El consentimiento es la llave del respeto mutuo. Solo es válido cuando se otorga con total libertad, sin chantajes emocionales, amenazas ni engaños de por medio.</w:t>
+              <w:t xml:space="preserve">Para que el consentimiento sea válido, nadie debe presionar, amenazar o manipular. La decisión debe tomarse con total tranquilidad y conocimiento.</w:t>
             </w:r>
           </w:p>
         </w:tc>
@@ -16451,7 +16451,7 @@
                 <w:sz w:val="17"/>
                 <w:szCs w:val="17"/>
               </w:rPr>
-              <w:t xml:space="preserve">Duración asignada: 9 s</w:t>
+              <w:t xml:space="preserve">Duración asignada: 10 s</w:t>
             </w:r>
           </w:p>
         </w:tc>
@@ -16531,7 +16531,7 @@
                 <w:sz w:val="17"/>
                 <w:szCs w:val="17"/>
               </w:rPr>
-              <w:t xml:space="preserve">Modern anime style. The boy standing tall with calm self-assurance, gesturing politely with an open palm to say no to peer pressure. Atmospheric clarity. No text drawn by AI.</w:t>
+              <w:t xml:space="preserve">Modern anime style 16:9 widescreen illustration. Two 13-year-old student explorers, a girl with braided hair and a boy in a teal jacket, expressing a calm and assertive refusal in front of peers, surrounded by a gentle aura of dignity and self-respect, with generous negative space for text overlays. No text drawn by AI.</w:t>
             </w:r>
           </w:p>
           <w:p>
@@ -16574,7 +16574,7 @@
                 <w:sz w:val="18"/>
                 <w:szCs w:val="18"/>
               </w:rPr>
-              <w:t xml:space="preserve">Decir 'no' es un acto de valentía y autocuidado. La asertividad nos permite expresar lo que queremos y lo que rechazamos con tranquilidad y total firmeza.</w:t>
+              <w:t xml:space="preserve">Decir no con seguridad es un derecho inviolable. La asertividad nos permite fijar límites personales claros frente a la presión de grupo.</w:t>
             </w:r>
           </w:p>
         </w:tc>
@@ -16626,7 +16626,7 @@
                 <w:sz w:val="17"/>
                 <w:szCs w:val="17"/>
               </w:rPr>
-              <w:t xml:space="preserve">Duración asignada: 9 s</w:t>
+              <w:t xml:space="preserve">Duración asignada: 10 s</w:t>
             </w:r>
           </w:p>
         </w:tc>
@@ -16706,7 +16706,7 @@
                 <w:sz w:val="17"/>
                 <w:szCs w:val="17"/>
               </w:rPr>
-              <w:t xml:space="preserve">Modern anime style. Group of peers talking animatedly in a park, while our two young protagonists make a responsible, independent choice together. Clean lighting. No text drawn by AI.</w:t>
+              <w:t xml:space="preserve">Modern anime style 16:9 widescreen illustration. Two 13-year-old student explorers, a girl with braided hair and a boy in a teal jacket, holding a protective shield emblem safeguarding personal space and digital privacy against peer pressure, with generous negative space for text overlays. No text drawn by AI.</w:t>
             </w:r>
           </w:p>
           <w:p>
@@ -16749,7 +16749,7 @@
                 <w:sz w:val="18"/>
                 <w:szCs w:val="18"/>
               </w:rPr>
-              <w:t xml:space="preserve">A veces el grupo intenta empujarnos a actuar contra nuestros valores. La verdadera amistad no exige sacrificios dañinos ni pone en peligro tu bienestar personal.</w:t>
+              <w:t xml:space="preserve">El consentimiento también se aplica en el mundo digital: no compartir fotografías, mensajes o información privada de otros sin su autorización explícita.</w:t>
             </w:r>
           </w:p>
         </w:tc>
@@ -16801,7 +16801,7 @@
                 <w:sz w:val="17"/>
                 <w:szCs w:val="17"/>
               </w:rPr>
-              <w:t xml:space="preserve">Duración asignada: 9 s</w:t>
+              <w:t xml:space="preserve">Duración asignada: 11 s</w:t>
             </w:r>
           </w:p>
         </w:tc>
@@ -16881,7 +16881,7 @@
                 <w:sz w:val="17"/>
                 <w:szCs w:val="17"/>
               </w:rPr>
-              <w:t xml:space="preserve">Modern anime style. The girl consulting a kind school counselor and her family, showing a warm circle of protection and advice. Inviting warm tones. No text drawn by AI.</w:t>
+              <w:t xml:space="preserve">Modern anime style 16:9 widescreen illustration. Two 13-year-old student explorers, a girl with braided hair and a boy in a teal jacket, talking with a trusted teacher and guidance counselor in a brightly lit room, receiving supportive advice, with generous negative space for text overlays. No text drawn by AI.</w:t>
             </w:r>
           </w:p>
           <w:p>
@@ -16924,7 +16924,7 @@
                 <w:sz w:val="18"/>
                 <w:szCs w:val="18"/>
               </w:rPr>
-              <w:t xml:space="preserve">No estás solo ante dilemas difíciles. Acudir a tus padres, profesores o adultos de confianza te proporciona el respaldo necesario para resolver dudas y protegerte.</w:t>
+              <w:t xml:space="preserve">Si una situación nos incomoda o vulnera nuestros límites, acudir de inmediato a adultos de confianza en la familia o el colegio es indispensable.</w:t>
             </w:r>
           </w:p>
         </w:tc>
@@ -17056,7 +17056,7 @@
                 <w:sz w:val="17"/>
                 <w:szCs w:val="17"/>
               </w:rPr>
-              <w:t xml:space="preserve">Modern anime style. Both young explorers smiling with determination, their notebooks open and ready to analyze everyday cases. StudioSimple logo. No text drawn by AI.</w:t>
+              <w:t xml:space="preserve">Modern anime style 16:9 widescreen illustration. Two 13-year-old student explorers, a girl with braided hair and a boy in a teal jacket, holding open science notebooks, ready to evaluate ethical consent scenarios beside a StudioSimple badge, with generous negative space for text overlays. No text drawn by AI.</w:t>
             </w:r>
           </w:p>
           <w:p>
@@ -17099,7 +17099,7 @@
                 <w:sz w:val="18"/>
                 <w:szCs w:val="18"/>
               </w:rPr>
-              <w:t xml:space="preserve">Surge ahora el gran desafío: cuando alguien intenta traspasar nuestros límites en la vida diaria, ¿qué herramientas nos permiten protegernos y hacer respetar nuestro consentimiento?</w:t>
+              <w:t xml:space="preserve">Surge ahora el desafío ético: ante una decisión cotidiana con amigos, ¿cómo comprobamos que existe un consentimiento plenamente válido?</w:t>
             </w:r>
           </w:p>
         </w:tc>
@@ -17572,7 +17572,7 @@
                 <w:sz w:val="17"/>
                 <w:szCs w:val="17"/>
               </w:rPr>
-              <w:t xml:space="preserve">Duración asignada: 11 s</w:t>
+              <w:t xml:space="preserve">Duración asignada: 10 s</w:t>
             </w:r>
           </w:p>
         </w:tc>
@@ -17652,7 +17652,7 @@
                 <w:sz w:val="17"/>
                 <w:szCs w:val="17"/>
               </w:rPr>
-              <w:t xml:space="preserve">Modern anime style 16:9. The boy and girl standing before a clear circular emblem showing 'Libre', 'Informado', 'Explícito' y 'Revocable'. Clean modern typography. No text drawn by AI.</w:t>
+              <w:t xml:space="preserve">Modern anime style 16:9 widescreen illustration. Two 13-year-old student explorers, a girl with braided hair and a boy in a teal jacket, standing before a four-part criteria board illustrating consent: free, informed, specific, and revocable, with generous negative space for text overlays. No text drawn by AI.</w:t>
             </w:r>
           </w:p>
           <w:p>
@@ -17695,7 +17695,7 @@
                 <w:sz w:val="18"/>
                 <w:szCs w:val="18"/>
               </w:rPr>
-              <w:t xml:space="preserve">El objetivo de hoy es reconocer que el consentimiento mutuo, el respeto a los límites corporales y la toma de decisiones informadas son pilares del autocuidado.</w:t>
+              <w:t xml:space="preserve">El objetivo de la lección es analizar y aplicar los cuatro criterios innegociables del consentimiento: libre, informado, específico y siempre revocable.</w:t>
             </w:r>
           </w:p>
         </w:tc>
@@ -17747,7 +17747,7 @@
                 <w:sz w:val="17"/>
                 <w:szCs w:val="17"/>
               </w:rPr>
-              <w:t xml:space="preserve">Duración asignada: 11 s</w:t>
+              <w:t xml:space="preserve">Duración asignada: 10 s</w:t>
             </w:r>
           </w:p>
         </w:tc>
@@ -17827,7 +17827,7 @@
                 <w:sz w:val="17"/>
                 <w:szCs w:val="17"/>
               </w:rPr>
-              <w:t xml:space="preserve">Modern anime style. Medical and human rights emblem illustrating the personal boundary perimeter of a human figure with clear luminous borders. Crisp lines. No text drawn by AI.</w:t>
+              <w:t xml:space="preserve">Modern anime style 16:9 widescreen illustration. Two 13-year-old student explorers, a girl with braided hair and a boy in a teal jacket, analyzing a four-quadrant infographic breaking down unpressured choice, truth, context, and the right to revoke consent, with generous negative space for text overlays. No text drawn by AI.</w:t>
             </w:r>
           </w:p>
           <w:p>
@@ -17870,7 +17870,7 @@
                 <w:sz w:val="18"/>
                 <w:szCs w:val="18"/>
               </w:rPr>
-              <w:t xml:space="preserve">La autonomía corporal establece que cada persona tiene derecho exclusivo sobre su cuerpo. Nadie puede obligar a un adolescente a tolerar contactos o tratos indeseados.</w:t>
+              <w:t xml:space="preserve">El primer criterio exige que el consentimiento sea libre: sin chantajes, amenazas ni presiones de grupo. Si existe coacción, el consentimiento es nulo.</w:t>
             </w:r>
           </w:p>
         </w:tc>
@@ -18002,7 +18002,7 @@
                 <w:sz w:val="17"/>
                 <w:szCs w:val="17"/>
               </w:rPr>
-              <w:t xml:space="preserve">Modern anime style. Clean infographic panel displaying four pillars: 1. Libre de coacción, 2. Plenamente informado, 3. Específico, 4. Revocable. No text drawn by AI.</w:t>
+              <w:t xml:space="preserve">Modern anime style 16:9 widescreen illustration. Two 13-year-old student explorers, a girl with braided hair and a boy in a teal jacket, observing a student changing their mind during an activity with classmates stopping immediately and nodding respectfully, with generous negative space for text overlays. No text drawn by AI.</w:t>
             </w:r>
           </w:p>
           <w:p>
@@ -18045,7 +18045,7 @@
                 <w:sz w:val="18"/>
                 <w:szCs w:val="18"/>
               </w:rPr>
-              <w:t xml:space="preserve">Para que el consentimiento sea válido debe cumplir cuatro condiciones: otorgarse con plena libertad, con información clara, para una situación específica y con derecho a revocarlo en cualquier momento.</w:t>
+              <w:t xml:space="preserve">El segundo criterio exige que sea informado: conocer con claridad qué se propone y qué consecuencias tiene. El tercer criterio establece que sea específico para cada momento.</w:t>
             </w:r>
           </w:p>
         </w:tc>
@@ -18097,7 +18097,7 @@
                 <w:sz w:val="17"/>
                 <w:szCs w:val="17"/>
               </w:rPr>
-              <w:t xml:space="preserve">Duración asignada: 12 s</w:t>
+              <w:t xml:space="preserve">Duración asignada: 11 s</w:t>
             </w:r>
           </w:p>
         </w:tc>
@@ -18177,7 +18177,7 @@
                 <w:sz w:val="17"/>
                 <w:szCs w:val="17"/>
               </w:rPr>
-              <w:t xml:space="preserve">Modern anime style. The two companions role-playing a dialogue with calm confidence, using clear body language and respectful eye contact. Clean lighting. No text drawn by AI.</w:t>
+              <w:t xml:space="preserve">Modern anime style 16:9 widescreen illustration. Two 13-year-old student explorers, a girl with braided hair and a boy in a teal jacket, standing firmly in the light with moral confidence, resisting group pressure and upholding personal boundaries, with generous negative space for text overlays. No text drawn by AI.</w:t>
             </w:r>
           </w:p>
           <w:p>
@@ -18220,7 +18220,7 @@
                 <w:sz w:val="18"/>
                 <w:szCs w:val="18"/>
               </w:rPr>
-              <w:t xml:space="preserve">La asertividad se ubica entre la sumisión y la agresividad. Consiste en defender los derechos personales diciendo con calma lo que sentimos, sin herir pero sin ceder jamás.</w:t>
+              <w:t xml:space="preserve">El cuarto criterio es decisivo: el consentimiento es revocable. Cualquier persona tiene derecho a cambiar de opinión y detener una actividad cuando lo decida.</w:t>
             </w:r>
           </w:p>
         </w:tc>
@@ -18352,7 +18352,7 @@
                 <w:sz w:val="17"/>
                 <w:szCs w:val="17"/>
               </w:rPr>
-              <w:t xml:space="preserve">Modern anime style. Illustrated balance showing short-term impulse on one side and long-term well-being and safety on the other. Elegant cyan lighting. No text drawn by AI.</w:t>
+              <w:t xml:space="preserve">Modern anime style 16:9 widescreen illustration. Two 13-year-old student explorers, a girl with braided hair and a boy in a teal jacket, visualizing a glowing circle of trust with school counselors, teachers, and parents forming a protective network, with generous negative space for text overlays. No text drawn by AI.</w:t>
             </w:r>
           </w:p>
           <w:p>
@@ -18395,7 +18395,7 @@
                 <w:sz w:val="18"/>
                 <w:szCs w:val="18"/>
               </w:rPr>
-              <w:t xml:space="preserve">La responsabilidad individual nos pide proyectar las consecuencias de nuestros actos. Cada elección influye en nuestra salud, en nuestras metas personales y en la vida de quienes nos rodean.</w:t>
+              <w:t xml:space="preserve">La asertividad es la habilidad de expresar límites con firmeza y respeto. Reconocer situaciones de riesgo y pedir apoyo a docentes o apoderados refuerza la seguridad.</w:t>
             </w:r>
           </w:p>
         </w:tc>
@@ -18447,7 +18447,7 @@
                 <w:sz w:val="17"/>
                 <w:szCs w:val="17"/>
               </w:rPr>
-              <w:t xml:space="preserve">Duración asignada: 24 s</w:t>
+              <w:t xml:space="preserve">Duración asignada: 29 s</w:t>
             </w:r>
           </w:p>
         </w:tc>
@@ -18527,7 +18527,7 @@
                 <w:sz w:val="17"/>
                 <w:szCs w:val="17"/>
               </w:rPr>
-              <w:t xml:space="preserve">Modern anime style 16:9. The boy and girl firmly declining an intrusive digital request on a screen, protecting their data and privacy with calm authority. Clear lines. No text drawn by AI.</w:t>
+              <w:t xml:space="preserve">Modern anime style 16:9 widescreen illustration. Two 13-year-old student explorers, a girl with braided hair and a boy in a teal jacket, reviewing an illustrated decision flowchart of valid consent on a tablet at their desk, with generous negative space for text overlays. No text drawn by AI.</w:t>
             </w:r>
           </w:p>
           <w:p>
@@ -18570,7 +18570,7 @@
                 <w:sz w:val="18"/>
                 <w:szCs w:val="18"/>
               </w:rPr>
-              <w:t xml:space="preserve">Analicemos un caso concreto: un grupo de compañeros insiste para que un estudiante comparta una fotografía privada de otra persona o propia. El estudiante se niega con firmeza diciendo que la privacidad debe respetarse. ¿Qué principio de responsabilidad y autocuidado se evidencia? Se evidencia el principio del consentimiento y el respeto a la privacidad, estableciendo un límite claro ante la presión del grupo.</w:t>
+              <w:t xml:space="preserve">Analicemos un caso concreto: un grupo insiste para que un estudiante comparta una foto privada ajena o propia y el estudiante se niega con firmeza diciendo que la privacidad debe respetarse. ¿Qué principio se evidencia? Se evidencia el ejercicio del consentimiento informado, el derecho a la privacidad y el uso de la asertividad para fijar límites claros frente a la presión de grupo.</w:t>
             </w:r>
           </w:p>
         </w:tc>
@@ -18622,7 +18622,7 @@
                 <w:sz w:val="17"/>
                 <w:szCs w:val="17"/>
               </w:rPr>
-              <w:t xml:space="preserve">Duración asignada: 12 s</w:t>
+              <w:t xml:space="preserve">Duración asignada: 13 s</w:t>
             </w:r>
           </w:p>
         </w:tc>
@@ -18702,7 +18702,7 @@
                 <w:sz w:val="17"/>
                 <w:szCs w:val="17"/>
               </w:rPr>
-              <w:t xml:space="preserve">Modern anime style. StudioSimple emblem with an inspiring emblem: 'Mi Cuerpo, Mis Límites | Consentimiento = Respeto Mutuo'. High contrast colors. No text drawn by AI.</w:t>
+              <w:t xml:space="preserve">Modern anime style 16:9 widescreen illustration. Two 13-year-old student explorers, a girl with braided hair and a boy in a teal jacket, presenting a protective shield with four gold stars representing the criteria of consent beside a StudioSimple emblem, with generous negative space for text overlays. No text drawn by AI.</w:t>
             </w:r>
           </w:p>
           <w:p>
@@ -18745,7 +18745,7 @@
                 <w:sz w:val="18"/>
                 <w:szCs w:val="18"/>
               </w:rPr>
-              <w:t xml:space="preserve">Recuerda la regla de oro: mi cuerpo, mis límites; tu cuerpo, tus límites: el consentimiento es la clave del respeto. ¡Ahora demostraremos lo aprendido en las actividades de la plataforma!</w:t>
+              <w:t xml:space="preserve">Recuerda la regla de oro: el consentimiento debe ser libre, informado, específico y siempre revocable. ¡Ahora pon a prueba lo aprendido resolviendo las actividades prácticas en la plataforma interactiva!</w:t>
             </w:r>
           </w:p>
         </w:tc>
@@ -18773,10 +18773,10 @@
           <w:b/>
           <w:bCs/>
         </w:rPr>
-        <w:t xml:space="preserve">Comprobación 1 (Identificación de señales de coacción): </w:t>
-      </w:r>
-      <w:r>
-        <w:t xml:space="preserve">¿Por qué frases como 'si de verdad fueras mi amigo lo harías' son formas de manipulación que anulan el consentimiento?</w:t>
+        <w:t xml:space="preserve">Comprobación 1 (Caso 1: Negativa asertiva ante presión digital): </w:t>
+      </w:r>
+      <w:r>
+        <w:t xml:space="preserve">Un grupo de compañeros insiste para que un estudiante comparta una fotografía privada de otra persona o propia. El estudiante se niega con firmeza diciendo que la privacidad debe respetarse. ¿Qué principio de responsabilidad y autocuidado se evidencia?</w:t>
       </w:r>
     </w:p>
     <w:p>
@@ -18792,7 +18792,7 @@
         <w:t xml:space="preserve">• Respuesta esperada: </w:t>
       </w:r>
       <w:r>
-        <w:t xml:space="preserve">Porque utilizan el chantaje emocional y la culpa para forzar a alguien a actuar contra su voluntad, impidiendo una decisión verdaderamente libre.</w:t>
+        <w:t xml:space="preserve">Se evidencia el principio del consentimiento y el respeto a la privacidad, estableciendo un límite claro mediante comunicación asertiva ante la presión del grupo.</w:t>
       </w:r>
       <w:r>
         <w:rPr>
@@ -18803,7 +18803,7 @@
         <w:t xml:space="preserve"> | Pista socrática: </w:t>
       </w:r>
       <w:r>
-        <w:t xml:space="preserve">Observa la intención de la frase: ¿respeta la libertad del otro o lo amenaza con retirar la amistad?</w:t>
+        <w:t xml:space="preserve">Fíjate en la acción: decir 'no' frente a la insistencia para proteger la intimidad. ¿Qué principios aprendidos representa?</w:t>
       </w:r>
     </w:p>
     <w:p>
@@ -18819,7 +18819,7 @@
         <w:t xml:space="preserve">• Texto revelado al estudiante: </w:t>
       </w:r>
       <w:r>
-        <w:t xml:space="preserve">Porque es un chantaje emocional que presiona mediante la culpa para forzar la decisión.</w:t>
+        <w:t xml:space="preserve">El principio del consentimiento y la privacidad, defendiendo sus límites con asertividad.</w:t>
       </w:r>
     </w:p>
     <w:p>
@@ -18831,10 +18831,10 @@
           <w:b/>
           <w:bCs/>
         </w:rPr>
-        <w:t xml:space="preserve">Comprobación 2 (Búsqueda activa de ayuda): </w:t>
-      </w:r>
-      <w:r>
-        <w:t xml:space="preserve">Si una persona siente que sus límites están siendo vulnerados de manera reiterada por alguien en el colegio, ¿qué debe hacer de inmediato?</w:t>
+        <w:t xml:space="preserve">Comprobación 2 (Caso 2: Redes de apoyo ante el acoso): </w:t>
+      </w:r>
+      <w:r>
+        <w:t xml:space="preserve">Un adolescente nota que una compañera está siendo presionada en los recreos y se siente asustada. ¿Qué acción responsable y solidaria puede realizar para apoyarla?</w:t>
       </w:r>
     </w:p>
     <w:p>
@@ -18850,7 +18850,7 @@
         <w:t xml:space="preserve">• Respuesta esperada: </w:t>
       </w:r>
       <w:r>
-        <w:t xml:space="preserve">Comunicarlo de forma inmediata a un adulto de confianza (padres, profesores, inspector o psicólogo escolar) para activar redes de protección.</w:t>
+        <w:t xml:space="preserve">Acompañarla, validar su malestar y acudir junto a ella a informar a un profesor, inspector o adulto de confianza para detener la situación.</w:t>
       </w:r>
       <w:r>
         <w:rPr>
@@ -18861,7 +18861,7 @@
         <w:t xml:space="preserve"> | Pista socrática: </w:t>
       </w:r>
       <w:r>
-        <w:t xml:space="preserve">Piensa en el rol protector de los adultos en la escuela y el hogar ante situaciones injustas.</w:t>
+        <w:t xml:space="preserve">Piensa en no ser un espectador pasivo: ¿cómo podemos conectar a la víctima con adultos que puedan ayudarla?</w:t>
       </w:r>
     </w:p>
     <w:p>
@@ -18877,7 +18877,7 @@
         <w:t xml:space="preserve">• Texto revelado al estudiante: </w:t>
       </w:r>
       <w:r>
-        <w:t xml:space="preserve">Avisar de inmediato a sus padres o profesores para que intervengan y lo protejan.</w:t>
+        <w:t xml:space="preserve">Acompañarla y avisar a un profesor o adulto responsable para que intervenga.</w:t>
       </w:r>
     </w:p>
     <w:p>
@@ -20794,7 +20794,7 @@
                 <w:sz w:val="17"/>
                 <w:szCs w:val="17"/>
               </w:rPr>
-              <w:t xml:space="preserve">Duración asignada: 9 s</w:t>
+              <w:t xml:space="preserve">Duración asignada: 10 s</w:t>
             </w:r>
           </w:p>
         </w:tc>
@@ -20874,7 +20874,7 @@
                 <w:sz w:val="17"/>
                 <w:szCs w:val="17"/>
               </w:rPr>
-              <w:t xml:space="preserve">Modern anime style 16:9 widescreen illustration. Two 13-year-old student explorers, a girl with braided hair and a boy in a teal jacket, examining a glowing digital holographic board displaying shattered question marks and science icons in a bright modern classroom. Warm morning lighting, clean negative space in upper third. No text drawn by AI.</w:t>
+              <w:t xml:space="preserve">Modern anime style 16:9 widescreen illustration. Two 13-year-old student explorers, a girl with braided hair and a boy in a teal jacket, reviewing a digital display that debunks popular adolescent myths with verified scientific evidence, with generous negative space for text overlays. No text drawn by AI.</w:t>
             </w:r>
           </w:p>
           <w:p>
@@ -20917,7 +20917,7 @@
                 <w:sz w:val="18"/>
                 <w:szCs w:val="18"/>
               </w:rPr>
-              <w:t xml:space="preserve">Bienvenidos a una nueva clase de ciencias. Hoy utilizaremos la evidencia biológica para derribar mitos y construir una convivencia basada en el respeto.</w:t>
+              <w:t xml:space="preserve">Comienza una expedición de pensamiento crítico en ciencias. Alrededor de la pubertad circulan muchas creencias populares que no tienen respaldo científico.</w:t>
             </w:r>
           </w:p>
         </w:tc>
@@ -20969,7 +20969,7 @@
                 <w:sz w:val="17"/>
                 <w:szCs w:val="17"/>
               </w:rPr>
-              <w:t xml:space="preserve">Duración asignada: 8 s</w:t>
+              <w:t xml:space="preserve">Duración asignada: 11 s</w:t>
             </w:r>
           </w:p>
         </w:tc>
@@ -21049,7 +21049,7 @@
                 <w:sz w:val="17"/>
                 <w:szCs w:val="17"/>
               </w:rPr>
-              <w:t xml:space="preserve">Modern anime style. Diverse group of healthy teenage silhouettes showing varying heights, voices, and build in soft pastel colors, all standing together proudly. Clean composition. No text drawn by AI.</w:t>
+              <w:t xml:space="preserve">Modern anime style 16:9 widescreen illustration. Two 13-year-old student explorers, a girl with braided hair and a boy in a teal jacket, observing a distorted mirror being replaced with a clean, realistic medical illustration of pubertal growth, with generous negative space for text overlays. No text drawn by AI.</w:t>
             </w:r>
           </w:p>
           <w:p>
@@ -21092,7 +21092,7 @@
                 <w:sz w:val="18"/>
                 <w:szCs w:val="18"/>
               </w:rPr>
-              <w:t xml:space="preserve">A menudo creemos erróneamente que todos debemos cambiar al mismo ritmo. La biología nos muestra que cada organismo tiene su propia cadencia natural.</w:t>
+              <w:t xml:space="preserve">Muchos creen que todos los adolescentes deben pegar el estirón al mismo tiempo. La biología demuestra que cada cuerpo tiene su propio reloj genético.</w:t>
             </w:r>
           </w:p>
         </w:tc>
@@ -21144,7 +21144,7 @@
                 <w:sz w:val="17"/>
                 <w:szCs w:val="17"/>
               </w:rPr>
-              <w:t xml:space="preserve">Duración asignada: 8 s</w:t>
+              <w:t xml:space="preserve">Duración asignada: 11 s</w:t>
             </w:r>
           </w:p>
         </w:tc>
@@ -21224,7 +21224,7 @@
                 <w:sz w:val="17"/>
                 <w:szCs w:val="17"/>
               </w:rPr>
-              <w:t xml:space="preserve">Modern anime style. Illustration of an internal genetic clock with luminous gears peacefully turning inside a DNA strand, radiating gentle turquoise light. Minimalist aesthetics. No text drawn by AI.</w:t>
+              <w:t xml:space="preserve">Modern anime style 16:9 widescreen illustration. Two 13-year-old student explorers, a girl with braided hair and a boy in a teal jacket, examining a bell-curve growth graph demonstrating the natural developmental diversity between ages 10 and 16, with generous negative space for text overlays. No text drawn by AI.</w:t>
             </w:r>
           </w:p>
           <w:p>
@@ -21267,7 +21267,7 @@
                 <w:sz w:val="18"/>
                 <w:szCs w:val="18"/>
               </w:rPr>
-              <w:t xml:space="preserve">No existe un botón mágico simultáneo. El eje hipotálamo-hipófisis se activa en tiempos distintos según la genética de cada persona.</w:t>
+              <w:t xml:space="preserve">El inicio de la pubertad se extiende normalmente entre los 10 y 16 años. Crecer antes o después no significa tener una enfermedad o deficiencia.</w:t>
             </w:r>
           </w:p>
         </w:tc>
@@ -21319,7 +21319,7 @@
                 <w:sz w:val="17"/>
                 <w:szCs w:val="17"/>
               </w:rPr>
-              <w:t xml:space="preserve">Duración asignada: 9 s</w:t>
+              <w:t xml:space="preserve">Duración asignada: 10 s</w:t>
             </w:r>
           </w:p>
         </w:tc>
@@ -21399,7 +21399,7 @@
                 <w:sz w:val="17"/>
                 <w:szCs w:val="17"/>
               </w:rPr>
-              <w:t xml:space="preserve">Modern anime style. Two teens having an honest conversation, one listening attentively while the other expresses feelings openly, surrounded by calm blue light particles. No text drawn by AI.</w:t>
+              <w:t xml:space="preserve">Modern anime style 16:9 widescreen illustration. Two 13-year-old student explorers, a girl with braided hair and a boy in a teal jacket, collaborating in a science lab with robotics tools and culinary chemistry, demonstrating equal capabilities without gender stereotypes, with generous negative space for text overlays. No text drawn by AI.</w:t>
             </w:r>
           </w:p>
           <w:p>
@@ -21442,7 +21442,7 @@
                 <w:sz w:val="18"/>
                 <w:szCs w:val="18"/>
               </w:rPr>
-              <w:t xml:space="preserve">Frases como 'los hombres no lloran' son mandatos culturales dañinos. Reconocer y expresar lo que sentimos es un signo de madurez y salud mental.</w:t>
+              <w:t xml:space="preserve">Los estereotipos de género también son mitos culturales sin base biológica. Hombres y mujeres tienen iguales capacidades cognitivas, artísticas y científicas.</w:t>
             </w:r>
           </w:p>
         </w:tc>
@@ -21574,7 +21574,7 @@
                 <w:sz w:val="17"/>
                 <w:szCs w:val="17"/>
               </w:rPr>
-              <w:t xml:space="preserve">Modern anime style. Student holding a magnifying glass displaying scientific peer-reviewed facts over filtered artificial social media imagery. Clear contrast. No text drawn by AI.</w:t>
+              <w:t xml:space="preserve">Modern anime style 16:9 widescreen illustration. Two 13-year-old student explorers, a girl with braided hair and a boy in a teal jacket, holding a glowing magnifying glass revealing verified biological facts over misleading social media headlines, with generous negative space for text overlays. No text drawn by AI.</w:t>
             </w:r>
           </w:p>
           <w:p>
@@ -21617,7 +21617,7 @@
                 <w:sz w:val="18"/>
                 <w:szCs w:val="18"/>
               </w:rPr>
-              <w:t xml:space="preserve">Las redes suelen mostrar imágenes retocadas y consejos sin base científica. Debemos filtrar esa información consultando a profesionales de la salud y fuentes oficiales.</w:t>
+              <w:t xml:space="preserve">El acné puberal responde a estímulos hormonales en las glándulas sebáceas, no a la suciedad ni a castigos imaginarios.</w:t>
             </w:r>
           </w:p>
         </w:tc>
@@ -21749,7 +21749,7 @@
                 <w:sz w:val="17"/>
                 <w:szCs w:val="17"/>
               </w:rPr>
-              <w:t xml:space="preserve">Modern anime style. The boy and girl collaborating in a science lab, creating an environment of mutual encouragement, smiling and holding notebooks. Bright natural daylight. No text drawn by AI.</w:t>
+              <w:t xml:space="preserve">Modern anime style 16:9 widescreen illustration. Two 13-year-old student explorers, a girl with braided hair and a boy in a teal jacket, celebrating diverse talents and unique growth trajectories with classmates in an inclusive classroom, with generous negative space for text overlays. No text drawn by AI.</w:t>
             </w:r>
           </w:p>
           <w:p>
@@ -21792,7 +21792,7 @@
                 <w:sz w:val="18"/>
                 <w:szCs w:val="18"/>
               </w:rPr>
-              <w:t xml:space="preserve">El aula y el patio deben ser espacios seguros. Apoyar a nuestros compañeros y frenar las burlas nos hace crecer como comunidad.</w:t>
+              <w:t xml:space="preserve">Aprender a buscar información en fuentes médicas oficiales nos protege de la desinformación y fortalece nuestra autoestima y seguridad personal.</w:t>
             </w:r>
           </w:p>
         </w:tc>
@@ -21844,7 +21844,7 @@
                 <w:sz w:val="17"/>
                 <w:szCs w:val="17"/>
               </w:rPr>
-              <w:t xml:space="preserve">Duración asignada: 8 s</w:t>
+              <w:t xml:space="preserve">Duración asignada: 9 s</w:t>
             </w:r>
           </w:p>
         </w:tc>
@@ -21924,7 +21924,7 @@
                 <w:sz w:val="17"/>
                 <w:szCs w:val="17"/>
               </w:rPr>
-              <w:t xml:space="preserve">Modern anime style. Modern notebook opened with a quill and glowing banner: 'Evidencia Científica | Empatía Incondicional'. High aesthetic quality. No text drawn by AI.</w:t>
+              <w:t xml:space="preserve">Modern anime style 16:9 widescreen illustration. Two 13-year-old student explorers, a girl with braided hair and a boy in a teal jacket, holding open science notebooks, ready to debunk myths and analyze evidence beside a StudioSimple badge, with generous negative space for text overlays. No text drawn by AI.</w:t>
             </w:r>
           </w:p>
           <w:p>
@@ -21967,7 +21967,7 @@
                 <w:sz w:val="18"/>
                 <w:szCs w:val="18"/>
               </w:rPr>
-              <w:t xml:space="preserve">La ciencia nos entrega certezas para derribar mitos y vivir con tranquilidad. Veamos ahora los datos formales de la variabilidad biológica.</w:t>
+              <w:t xml:space="preserve">Surge ahora la pregunta clave: cuando escuchamos una afirmación sobre el desarrollo adolescente, ¿cómo usamos la evidencia científica para evaluarla?</w:t>
             </w:r>
           </w:p>
         </w:tc>
@@ -22440,7 +22440,7 @@
                 <w:sz w:val="17"/>
                 <w:szCs w:val="17"/>
               </w:rPr>
-              <w:t xml:space="preserve">Duración asignada: 11 s</w:t>
+              <w:t xml:space="preserve">Duración asignada: 9 s</w:t>
             </w:r>
           </w:p>
         </w:tc>
@@ -22520,7 +22520,7 @@
                 <w:sz w:val="17"/>
                 <w:szCs w:val="17"/>
               </w:rPr>
-              <w:t xml:space="preserve">Modern anime style 16:9. The boy and girl standing beside a clean scientific diagram detailing 'Variabilidad Biológica', 'Mitos Culturales' y 'Convivencia Saludable'. Clean UI. No text drawn by AI.</w:t>
+              <w:t xml:space="preserve">Modern anime style 16:9 widescreen illustration. Two 13-year-old student explorers, a girl with braided hair and a boy in a teal jacket, standing in front of a split-screen display contrasting popular myths with verified biological evidence, with generous negative space for text overlays. No text drawn by AI.</w:t>
             </w:r>
           </w:p>
           <w:p>
@@ -22563,7 +22563,7 @@
                 <w:sz w:val="18"/>
                 <w:szCs w:val="18"/>
               </w:rPr>
-              <w:t xml:space="preserve">El objetivo de esta sesión es evaluar críticamente mitos y estereotipos sobre la pubertad a la luz de la evidencia biológica y los derechos humanos.</w:t>
+              <w:t xml:space="preserve">El objetivo de la lección es refutar mitos sobre la pubertad usando evidencia biológica y criterios de salud integral.</w:t>
             </w:r>
           </w:p>
         </w:tc>
@@ -22615,7 +22615,7 @@
                 <w:sz w:val="17"/>
                 <w:szCs w:val="17"/>
               </w:rPr>
-              <w:t xml:space="preserve">Duración asignada: 13 s</w:t>
+              <w:t xml:space="preserve">Duración asignada: 11 s</w:t>
             </w:r>
           </w:p>
         </w:tc>
@@ -22695,7 +22695,7 @@
                 <w:sz w:val="17"/>
                 <w:szCs w:val="17"/>
               </w:rPr>
-              <w:t xml:space="preserve">Modern anime style. Medical timeline chart showing age brackets: 9 to 13 years for girls, 10 to 14 years for boys. Clear scientific curves and gentle pastel gradients. No text drawn by AI.</w:t>
+              <w:t xml:space="preserve">Modern anime style 16:9 widescreen illustration. Two 13-year-old student explorers, a girl with braided hair and a boy in a teal jacket, analyzing official growth curves from WHO and MINEDUC on a digital screen showing normal pubertal ranges between 10 and 16 years, with generous negative space for text overlays. No text drawn by AI.</w:t>
             </w:r>
           </w:p>
           <w:p>
@@ -22738,7 +22738,7 @@
                 <w:sz w:val="18"/>
                 <w:szCs w:val="18"/>
               </w:rPr>
-              <w:t xml:space="preserve">La medicina establece que el inicio de la pubertad abarca entre los 9 y 13 años en niñas, y entre los 10 y 14 en niños. Cualquier momento en este rango es biológicamente normal.</w:t>
+              <w:t xml:space="preserve">Las curvas de la OMS y el MINEDUC confirman que la pubertad inicia normalmente entre los 10 y 16 años según factores genéticos y nutricionales.</w:t>
             </w:r>
           </w:p>
         </w:tc>
@@ -22790,7 +22790,7 @@
                 <w:sz w:val="17"/>
                 <w:szCs w:val="17"/>
               </w:rPr>
-              <w:t xml:space="preserve">Duración asignada: 11 s</w:t>
+              <w:t xml:space="preserve">Duración asignada: 10 s</w:t>
             </w:r>
           </w:p>
         </w:tc>
@@ -22870,7 +22870,7 @@
                 <w:sz w:val="17"/>
                 <w:szCs w:val="17"/>
               </w:rPr>
-              <w:t xml:space="preserve">Modern anime style. Infographic displaying three interacting nodes: Genética parental, Nutrición balanceada y Eje endocrino hipofisario. Clean minimal lines. No text drawn by AI.</w:t>
+              <w:t xml:space="preserve">Modern anime style 16:9 widescreen illustration. Two 13-year-old student explorers, a girl with braided hair and a boy in a teal jacket, visualizing neural pathways and equal cognitive capabilities across diverse vocations and scientific fields, with generous negative space for text overlays. No text drawn by AI.</w:t>
             </w:r>
           </w:p>
           <w:p>
@@ -22913,7 +22913,7 @@
                 <w:sz w:val="18"/>
                 <w:szCs w:val="18"/>
               </w:rPr>
-              <w:t xml:space="preserve">La velocidad de maduración depende de una tríada: la carga genética heredada, el funcionamiento hormonal y hábitos como la nutrición y el descanso nocturno reparador.</w:t>
+              <w:t xml:space="preserve">El desarrollo puberal no es una carrera. Quienes experimentan cambios tempranos o tardíos alcanzan igualmente la madurez biológica completa con salud.</w:t>
             </w:r>
           </w:p>
         </w:tc>
@@ -23045,7 +23045,7 @@
                 <w:sz w:val="17"/>
                 <w:szCs w:val="17"/>
               </w:rPr>
-              <w:t xml:space="preserve">Modern anime style. Dual graphic showing girls performing astronomy and sports, and boys engaged in literature, cooking, and emotional dialogue. Bright positive colors. No text drawn by AI.</w:t>
+              <w:t xml:space="preserve">Modern anime style 16:9 widescreen illustration. Two 13-year-old student explorers, a girl with braided hair and a boy in a teal jacket, examining a scientific anatomical model of skin glands and hormonal changes during puberty, with generous negative space for text overlays. No text drawn by AI.</w:t>
             </w:r>
           </w:p>
           <w:p>
@@ -23088,7 +23088,7 @@
                 <w:sz w:val="18"/>
                 <w:szCs w:val="18"/>
               </w:rPr>
-              <w:t xml:space="preserve">Los estereotipos de género imponen conductas rígidas que carecen de respaldo biológico. Tanto hombres como mujeres tienen plena capacidad para destacar en cualquier disciplina y expresar afecto.</w:t>
+              <w:t xml:space="preserve">Los estereotipos que asignan roles rígidos según el sexo carecen de fundamento científico. La neurociencia confirma que la inteligencia y vocaciones no tienen límites de género.</w:t>
             </w:r>
           </w:p>
         </w:tc>
@@ -23220,7 +23220,7 @@
                 <w:sz w:val="17"/>
                 <w:szCs w:val="17"/>
               </w:rPr>
-              <w:t xml:space="preserve">Modern anime style. Diagram of protective social shields reflecting negative rumors, transforming them into constructive communication and support. Clean lighting. No text drawn by AI.</w:t>
+              <w:t xml:space="preserve">Modern anime style 16:9 widescreen illustration. Two 13-year-old student explorers, a girl with braided hair and a boy in a teal jacket, reviewing official pediatric health guides and verified scientific portals on their laptops, calm and reassured, with generous negative space for text overlays. No text drawn by AI.</w:t>
             </w:r>
           </w:p>
           <w:p>
@@ -23263,7 +23263,7 @@
                 <w:sz w:val="18"/>
                 <w:szCs w:val="18"/>
               </w:rPr>
-              <w:t xml:space="preserve">Opinar sobre los cuerpos ajenos genera ansiedad y aislamiento. El respeto a la privacidad y el apoyo entre compañeros construyen una cultura escolar protectora y saludable.</w:t>
+              <w:t xml:space="preserve">La salud puberal requiere hábitos concretos: alimentación balanceada, hidratación, actividad física regular y al menos ocho horas de sueño para la hormona del crecimiento.</w:t>
             </w:r>
           </w:p>
         </w:tc>
@@ -23315,7 +23315,7 @@
                 <w:sz w:val="17"/>
                 <w:szCs w:val="17"/>
               </w:rPr>
-              <w:t xml:space="preserve">Duración asignada: 28 s</w:t>
+              <w:t xml:space="preserve">Duración asignada: 20 s</w:t>
             </w:r>
           </w:p>
         </w:tc>
@@ -23395,7 +23395,7 @@
                 <w:sz w:val="17"/>
                 <w:szCs w:val="17"/>
               </w:rPr>
-              <w:t xml:space="preserve">Modern anime style 16:9. The boy and girl examining growth trajectory charts with a doctor in a modern pediatric consultation room, verifying natural variability curves. Bright clear illumination. No text drawn by AI.</w:t>
+              <w:t xml:space="preserve">Modern anime style 16:9 widescreen illustration. Two 13-year-old student explorers, a girl with braided hair and a boy in a teal jacket, analyzing an illustrated growth-percentile chart on their desk, comparing curves with calm scientific smiles, with generous negative space for text overlays. No text drawn by AI.</w:t>
             </w:r>
           </w:p>
           <w:p>
@@ -23438,7 +23438,7 @@
                 <w:sz w:val="18"/>
                 <w:szCs w:val="18"/>
               </w:rPr>
-              <w:t xml:space="preserve">Analicemos un caso concreto: un estudiante de 13 años siente angustia porque varios compañeros ya tuvieron el estirón puberal y él aún no, creyendo erróneamente que tiene un problema de salud o no crecerá. ¿Qué evidencia científica y biológica desmiente este mito y cómo debe explicarse? La evidencia indica que el estirón puberal no ocurre a la misma edad para todos; responde a ritmos genéticos individuales que se extienden normalmente entre los 10 y los 16 años, por lo que su desarrollo es biológicamente normal y no constituye una anomalía.</w:t>
+              <w:t xml:space="preserve">Analicemos un caso concreto: un estudiante de 13 años se angustia creyendo erróneamente que tiene una anomalía porque sus compañeros ya crecieron. La evidencia médica demuestra que el estirón puberal responde a relojes genéticos individuales que se manifiestan normalmente entre los 10 y 16 años.</w:t>
             </w:r>
           </w:p>
         </w:tc>
@@ -23490,7 +23490,7 @@
                 <w:sz w:val="17"/>
                 <w:szCs w:val="17"/>
               </w:rPr>
-              <w:t xml:space="preserve">Duración asignada: 10 s</w:t>
+              <w:t xml:space="preserve">Duración asignada: 17 s</w:t>
             </w:r>
           </w:p>
         </w:tc>
@@ -23520,7 +23520,7 @@
                 <w:sz w:val="18"/>
                 <w:szCs w:val="18"/>
               </w:rPr>
-              <w:t xml:space="preserve">Regla de Oro de la convivencia</w:t>
+              <w:t xml:space="preserve">Regla de Oro frente a los mitos</w:t>
             </w:r>
           </w:p>
           <w:p>
@@ -23570,7 +23570,7 @@
                 <w:sz w:val="17"/>
                 <w:szCs w:val="17"/>
               </w:rPr>
-              <w:t xml:space="preserve">Modern anime style. StudioSimple shield with inscribed motto: 'Diversidad es Riqueza | Convivencia con Respeto'. Dynamic vibrant accents. No text drawn by AI.</w:t>
+              <w:t xml:space="preserve">Modern anime style 16:9 widescreen illustration. Two 13-year-old student explorers, a girl with braided hair and a boy in a teal jacket, presenting a golden emblem of scientific evidence breaking a chain of myths beside a StudioSimple badge, with generous negative space for text overlays. No text drawn by AI.</w:t>
             </w:r>
           </w:p>
           <w:p>
@@ -23613,7 +23613,7 @@
                 <w:sz w:val="18"/>
                 <w:szCs w:val="18"/>
               </w:rPr>
-              <w:t xml:space="preserve">Recordemos: la diversidad biológica enriquece a la especie humana. ¡Respetar los ritmos de cada uno es el fundamento de una convivencia escolar ejemplar!</w:t>
+              <w:t xml:space="preserve">Recuerda la regla de oro: la ciencia desmiente prejuicios; cada cuerpo crece a su propio ritmo genético entre los 10 y 16 años. ¡Ahora pon a prueba lo aprendido resolviendo las actividades prácticas en la plataforma interactiva!</w:t>
             </w:r>
           </w:p>
         </w:tc>
@@ -23641,10 +23641,10 @@
           <w:b/>
           <w:bCs/>
         </w:rPr>
-        <w:t xml:space="preserve">Comprobación 1 (Distinción entre mito y hecho médico): </w:t>
-      </w:r>
-      <w:r>
-        <w:t xml:space="preserve">Si alguien afirma que tomar suplementos vitamínicos comerciales acelera el crecimiento puberal en jóvenes sanos, ¿qué responde la medicina?</w:t>
+        <w:t xml:space="preserve">Comprobación 1 (Caso 1: El mito del estirón puberal simultáneo): </w:t>
+      </w:r>
+      <w:r>
+        <w:t xml:space="preserve">Un estudiante de 13 años siente angustia porque varios compañeros ya tuvieron el estirón puberal y él aún no, creyendo erróneamente que tiene un problema de salud o no crecerá. ¿Qué evidencia científica y biológica desmiente este mito y cómo debe explicarse?</w:t>
       </w:r>
     </w:p>
     <w:p>
@@ -23660,7 +23660,7 @@
         <w:t xml:space="preserve">• Respuesta esperada: </w:t>
       </w:r>
       <w:r>
-        <w:t xml:space="preserve">La medicina responde que es un mito comercial; una alimentación balanceada y el descanso proporcionan todo lo necesario, y el ritmo lo determina la genética y las hormonas propias.</w:t>
+        <w:t xml:space="preserve">La evidencia indica que el estirón puberal no ocurre a la misma edad para todos; responde a ritmos genéticos individuales que se extienden normalmente entre los 10 y los 16 años, por lo que su desarrollo es biológicamente normal y no constituye una anomalía.</w:t>
       </w:r>
       <w:r>
         <w:rPr>
@@ -23671,7 +23671,7 @@
         <w:t xml:space="preserve"> | Pista socrática: </w:t>
       </w:r>
       <w:r>
-        <w:t xml:space="preserve">Considera qué factores regulan el crecimiento óseo: ¿pueden las vitaminas artificiales forzar a los genes a cambiar más rápido?</w:t>
+        <w:t xml:space="preserve">Recuerda las curvas de desarrollo de la OMS: ¿es normal que algunos jóvenes peguen el estirón antes y otros después?</w:t>
       </w:r>
     </w:p>
     <w:p>
@@ -23687,7 +23687,7 @@
         <w:t xml:space="preserve">• Texto revelado al estudiante: </w:t>
       </w:r>
       <w:r>
-        <w:t xml:space="preserve">Es un mito porque el crecimiento lo mandan los genes y las hormonas, no vitaminas mágicas.</w:t>
+        <w:t xml:space="preserve">La evidencia demuestra que el estirón ocurre en distintas edades según los genes de cada persona, entre los 10 y 16 años, siendo totalmente normal.</w:t>
       </w:r>
     </w:p>
     <w:p>
@@ -23699,10 +23699,10 @@
           <w:b/>
           <w:bCs/>
         </w:rPr>
-        <w:t xml:space="preserve">Comprobación 2 (Acción asertiva frente a la burla): </w:t>
-      </w:r>
-      <w:r>
-        <w:t xml:space="preserve">¿Cómo debe actuar un grupo de estudiantes cuando observa que en un chat de curso se difunden memes sobre el cuerpo de un compañero?</w:t>
+        <w:t xml:space="preserve">Comprobación 2 (Caso 2: Superación de estereotipos en el aula): </w:t>
+      </w:r>
+      <w:r>
+        <w:t xml:space="preserve">En una clase de tecnología y robótica, un grupo afirma que los puestos de programación son solo para hombres y que las mujeres deberían dedicarse solo a la decoración del proyecto. ¿Por qué esta afirmación es un estereotipo sin fundamento y qué impacto negativo genera?</w:t>
       </w:r>
     </w:p>
     <w:p>
@@ -23718,7 +23718,7 @@
         <w:t xml:space="preserve">• Respuesta esperada: </w:t>
       </w:r>
       <w:r>
-        <w:t xml:space="preserve">No reenviarlo, expresar en el chat que esa actitud no corresponde y avisar de inmediato a un profesor o adulto de confianza para proteger al compañero.</w:t>
+        <w:t xml:space="preserve">Es un estereotipo infundado porque no existe diferencia biológica o cognitiva en la capacidad intelectual o tecnológica entre géneros; genera discriminación, limita el desarrollo vocacional de las alumnas y empobrece el trabajo en equipo.</w:t>
       </w:r>
       <w:r>
         <w:rPr>
@@ -23729,7 +23729,7 @@
         <w:t xml:space="preserve"> | Pista socrática: </w:t>
       </w:r>
       <w:r>
-        <w:t xml:space="preserve">Piensa en el rol del observador activo: ¿basta con guardar silencio o es necesario detener la difusión?</w:t>
+        <w:t xml:space="preserve">Fíjate en las capacidades intelectuales: ¿hay cerebros masculinos o femeninos para programar o es una habilidad universal?</w:t>
       </w:r>
     </w:p>
     <w:p>
@@ -23745,7 +23745,7 @@
         <w:t xml:space="preserve">• Texto revelado al estudiante: </w:t>
       </w:r>
       <w:r>
-        <w:t xml:space="preserve">No compartir el meme, exigir respeto en el grupo y avisar a los profesores.</w:t>
+        <w:t xml:space="preserve">Es un estereotipo porque hombres y mujeres tienen la misma capacidad mental para programar y hacer ciencia.</w:t>
       </w:r>
     </w:p>
     <w:p>
@@ -24038,7 +24038,7 @@
           <w:b/>
           <w:bCs/>
         </w:rPr>
-        <w:t xml:space="preserve">La variabilidad en el inicio de la pubertad (entre los 9 y 14 años) demuestra que:</w:t>
+        <w:t xml:space="preserve">La variabilidad en el inicio de la pubertad (entre los 10 y 16 años) demuestra que:</w:t>
       </w:r>
     </w:p>
     <w:p>
@@ -24746,7 +24746,7 @@
         <w:t xml:space="preserve">Pregunta 1: </w:t>
       </w:r>
       <w:r>
-        <w:t xml:space="preserve">La variabilidad en el inicio de la pubertad (entre los 9 y 14 años) demuestra que:</w:t>
+        <w:t xml:space="preserve">La variabilidad en el inicio de la pubertad (entre los 10 y 16 años) demuestra que:</w:t>
       </w:r>
     </w:p>
     <w:p>
@@ -25662,7 +25662,7 @@
                 <w:sz w:val="17"/>
                 <w:szCs w:val="17"/>
               </w:rPr>
-              <w:t xml:space="preserve">Duración asignada: 9 s</w:t>
+              <w:t xml:space="preserve">Duración asignada: 11 s</w:t>
             </w:r>
           </w:p>
         </w:tc>
@@ -25742,7 +25742,7 @@
                 <w:sz w:val="17"/>
                 <w:szCs w:val="17"/>
               </w:rPr>
-              <w:t xml:space="preserve">Modern anime style 16:9 widescreen illustration. Two 13-year-old student explorers, a girl with braided hair and a boy in a teal jacket, standing at the summit of a grand panoramic scientific observatory overlooking illuminated concept maps of human biology. Warm morning lighting, clean negative space in upper third. No text drawn by AI.</w:t>
+              <w:t xml:space="preserve">Modern anime style 16:9 widescreen illustration. Two 13-year-old student explorers, a girl with braided hair and a boy in a teal jacket, standing at the entrance of a high-tech science evaluation room, reviewing their comprehensive unit portfolio, with generous negative space for text overlays. No text drawn by AI.</w:t>
             </w:r>
           </w:p>
           <w:p>
@@ -25785,7 +25785,7 @@
                 <w:sz w:val="18"/>
                 <w:szCs w:val="18"/>
               </w:rPr>
-              <w:t xml:space="preserve">Llegamos a la cumbre de nuestra unidad de Ciencias Naturales. Hoy pondremos a prueba todo lo aprendido enfrentando reactivos con estándar oficial del MINEDUC.</w:t>
+              <w:t xml:space="preserve">Comienza la clase de síntesis de Ciencias Naturales para el OA 1. Hoy consolidaremos todos los aprendizajes adquiridos a lo largo de esta unidad curricular.</w:t>
             </w:r>
           </w:p>
         </w:tc>
@@ -25837,7 +25837,7 @@
                 <w:sz w:val="17"/>
                 <w:szCs w:val="17"/>
               </w:rPr>
-              <w:t xml:space="preserve">Duración asignada: 9 s</w:t>
+              <w:t xml:space="preserve">Duración asignada: 10 s</w:t>
             </w:r>
           </w:p>
         </w:tc>
@@ -25917,7 +25917,7 @@
                 <w:sz w:val="17"/>
                 <w:szCs w:val="17"/>
               </w:rPr>
-              <w:t xml:space="preserve">Modern anime style. Comprehensive holographic network displaying the 5 integrated nodes: Biológica, Psicológica, Afectiva, Sociocultural y Ética, interconnected with glowing teal threads. No text drawn by AI.</w:t>
+              <w:t xml:space="preserve">Modern anime style 16:9 widescreen illustration. Two 13-year-old student explorers, a girl with braided hair and a boy in a teal jacket, in a high-tech science examination hall, with clean multiple-choice options A, B, C, D softly illuminated in cyan, with generous negative space for text overlays. No text drawn by AI.</w:t>
             </w:r>
           </w:p>
           <w:p>
@@ -25960,7 +25960,7 @@
                 <w:sz w:val="18"/>
                 <w:szCs w:val="18"/>
               </w:rPr>
-              <w:t xml:space="preserve">El aprendizaje es integral. Desde los caracteres sexuales y las hormonas hasta el consentimiento y la afectividad, cada pieza encaja para entender el desarrollo humano.</w:t>
+              <w:t xml:space="preserve">Repasamos que la sexualidad humana es una vivencia integral que articula las dimensiones biológica, afectiva, social y ética durante toda la vida.</w:t>
             </w:r>
           </w:p>
         </w:tc>
@@ -26092,7 +26092,7 @@
                 <w:sz w:val="17"/>
                 <w:szCs w:val="17"/>
               </w:rPr>
-              <w:t xml:space="preserve">Modern anime style. Close-up of a structured exam sheet with an illuminated magnifying glass revealing the anatomy of a question: Context, Question Stem, Key, Distractors. Crisp lines. No text drawn by AI.</w:t>
+              <w:t xml:space="preserve">Modern anime style 16:9 widescreen illustration. Two 13-year-old student explorers, a girl with braided hair and a boy in a teal jacket, observing a panoramic holographic map synthesizing the biological, affective, social, and ethical dimensions, with generous negative space for text overlays. No text drawn by AI.</w:t>
             </w:r>
           </w:p>
           <w:p>
@@ -26135,7 +26135,7 @@
                 <w:sz w:val="18"/>
                 <w:szCs w:val="18"/>
               </w:rPr>
-              <w:t xml:space="preserve">Una pregunta formal de selección múltiple no busca engañar, sino evaluar la solidez del razonamiento científico a través de distractores construidos sobre ideas parciales.</w:t>
+              <w:t xml:space="preserve">Comprendimos que la pubertad es activada por el sistema endocrino, diferenciando órganos primarios de caracteres secundarios hormonales.</w:t>
             </w:r>
           </w:p>
         </w:tc>
@@ -26187,7 +26187,7 @@
                 <w:sz w:val="17"/>
                 <w:szCs w:val="17"/>
               </w:rPr>
-              <w:t xml:space="preserve">Duración asignada: 8 s</w:t>
+              <w:t xml:space="preserve">Duración asignada: 10 s</w:t>
             </w:r>
           </w:p>
         </w:tc>
@@ -26267,7 +26267,7 @@
                 <w:sz w:val="17"/>
                 <w:szCs w:val="17"/>
               </w:rPr>
-              <w:t xml:space="preserve">Modern anime style. The two students methodically crossing out erroneous options with red light pens and highlighting the single complete answer with emerald green light. No text drawn by AI.</w:t>
+              <w:t xml:space="preserve">Modern anime style 16:9 widescreen illustration. Two 13-year-old student explorers, a girl with braided hair and a boy in a teal jacket, examining an endocrine feedback loop diagram showing the pituitary gland and secondary sexual characteristics, with generous negative space for text overlays. No text drawn by AI.</w:t>
             </w:r>
           </w:p>
           <w:p>
@@ -26310,7 +26310,7 @@
                 <w:sz w:val="18"/>
                 <w:szCs w:val="18"/>
               </w:rPr>
-              <w:t xml:space="preserve">Frente a cuatro opciones, leemos críticamente: descartamos aquellas que contradicen las leyes biológicas o que ignoran la complejidad humana hasta hallar la respuesta exacta.</w:t>
+              <w:t xml:space="preserve">Afianzamos que los vínculos afectivos sanos se fundan en la empatía sincera, la reciprocidad y el cuidado riguroso de la intimidad personal.</w:t>
             </w:r>
           </w:p>
         </w:tc>
@@ -26362,7 +26362,7 @@
                 <w:sz w:val="17"/>
                 <w:szCs w:val="17"/>
               </w:rPr>
-              <w:t xml:space="preserve">Duración asignada: 10 s</w:t>
+              <w:t xml:space="preserve">Duración asignada: 8 s</w:t>
             </w:r>
           </w:p>
         </w:tc>
@@ -26442,7 +26442,7 @@
                 <w:sz w:val="17"/>
                 <w:szCs w:val="17"/>
               </w:rPr>
-              <w:t xml:space="preserve">Modern anime style. Student writing a precise deductive proof in a notebook: 'Porque el estirón varía según la genética...'. Beautiful handwriting illustration. No text drawn by AI.</w:t>
+              <w:t xml:space="preserve">Modern anime style 16:9 widescreen illustration. Two 13-year-old student explorers, a girl with braided hair and a boy in a teal jacket, holding an emblem of mutual dignity and consent with four interlocking glowing rings, with generous negative space for text overlays. No text drawn by AI.</w:t>
             </w:r>
           </w:p>
           <w:p>
@@ -26485,7 +26485,7 @@
                 <w:sz w:val="18"/>
                 <w:szCs w:val="18"/>
               </w:rPr>
-              <w:t xml:space="preserve">Saber cuál es la respuesta correcta es solo el inicio; lo verdaderamente valioso es ser capaz de explicar por qué es la correcta utilizando el vocabulario científico de la asignatura.</w:t>
+              <w:t xml:space="preserve">Validamos que el consentimiento debe cumplir cuatro condiciones innegociables: ser libre, informado, específico y revocable en todo instante.</w:t>
             </w:r>
           </w:p>
         </w:tc>
@@ -26537,7 +26537,7 @@
                 <w:sz w:val="17"/>
                 <w:szCs w:val="17"/>
               </w:rPr>
-              <w:t xml:space="preserve">Duración asignada: 8 s</w:t>
+              <w:t xml:space="preserve">Duración asignada: 10 s</w:t>
             </w:r>
           </w:p>
         </w:tc>
@@ -26617,7 +26617,7 @@
                 <w:sz w:val="17"/>
                 <w:szCs w:val="17"/>
               </w:rPr>
-              <w:t xml:space="preserve">Modern anime style. The girl and boy taking deep, peaceful breaths before beginning their test, radiating focus and tranquility in a calm testing hall. Warm golden ambient light. No text drawn by AI.</w:t>
+              <w:t xml:space="preserve">Modern anime style 16:9 widescreen illustration. Two 13-year-old student explorers, a girl with braided hair and a boy in a teal jacket, analyzing an official MINEDUC growth percentile chart demonstrating normal developmental tracks between 10 and 16 years, with generous negative space for text overlays. No text drawn by AI.</w:t>
             </w:r>
           </w:p>
           <w:p>
@@ -26660,7 +26660,7 @@
                 <w:sz w:val="18"/>
                 <w:szCs w:val="18"/>
               </w:rPr>
-              <w:t xml:space="preserve">El conocimiento ya está en tu mente. Mantener la calma, administrar el tiempo y leer cada palabra sin prisas te permitirá plasmar todo tu potencial.</w:t>
+              <w:t xml:space="preserve">Derribamos mitos sobre el crecimiento adolescente, fundamentando que la variabilidad entre los 10 y 16 años es un hecho biológico normal.</w:t>
             </w:r>
           </w:p>
         </w:tc>
@@ -26712,7 +26712,7 @@
                 <w:sz w:val="17"/>
                 <w:szCs w:val="17"/>
               </w:rPr>
-              <w:t xml:space="preserve">Duración asignada: 8 s</w:t>
+              <w:t xml:space="preserve">Duración asignada: 9 s</w:t>
             </w:r>
           </w:p>
         </w:tc>
@@ -26792,7 +26792,7 @@
                 <w:sz w:val="17"/>
                 <w:szCs w:val="17"/>
               </w:rPr>
-              <w:t xml:space="preserve">Modern anime style. Glowing doorway leading to a lecture hall with the inscription: 'Examen Libre: Estándar Oficial MINEDUC'. High detail digital art. No text drawn by AI.</w:t>
+              <w:t xml:space="preserve">Modern anime style 16:9 widescreen illustration. Two 13-year-old student explorers, a girl with braided hair and a boy in a teal jacket, holding open science notebooks fully completed, smiling with triumphant focus beside a StudioSimple badge, with generous negative space for text overlays. No text drawn by AI.</w:t>
             </w:r>
           </w:p>
           <w:p>
@@ -26835,7 +26835,7 @@
                 <w:sz w:val="18"/>
                 <w:szCs w:val="18"/>
               </w:rPr>
-              <w:t xml:space="preserve">Es hora de entrar en acción. En la siguiente etapa modelaremos paso a paso la resolución de una pregunta oficial de cuatro alternativas. ¡Adelante!</w:t>
+              <w:t xml:space="preserve">Estamos listos para enfrentar la evaluación formativa formal: ¿cómo aplicamos el método científico para justificar cada respuesta del examen libre?</w:t>
             </w:r>
           </w:p>
         </w:tc>
@@ -27338,7 +27338,7 @@
                 <w:sz w:val="18"/>
                 <w:szCs w:val="18"/>
               </w:rPr>
-              <w:t xml:space="preserve">Objetivo de la sesión</w:t>
+              <w:t xml:space="preserve">Objetivo de la lección</w:t>
             </w:r>
           </w:p>
           <w:p>
@@ -27388,7 +27388,7 @@
                 <w:sz w:val="17"/>
                 <w:szCs w:val="17"/>
               </w:rPr>
-              <w:t xml:space="preserve">Modern anime style 16:9. The boy and girl reviewing an official MINEDUC rubric rubric document titled 'Criterios de Evaluación OA 1 Ciencias 7° Básico' on a high-tech glass tablet. Clean aesthetics. No text drawn by AI.</w:t>
+              <w:t xml:space="preserve">Modern anime style 16:9 widescreen illustration. Two 13-year-old student explorers, a girl with braided hair and a boy in a teal jacket, standing before an exam review board showing an official MINEDUC multiple-choice item with options A, B, C, D clearly laid out, with generous negative space for text overlays. No text drawn by AI.</w:t>
             </w:r>
           </w:p>
           <w:p>
@@ -27431,7 +27431,7 @@
                 <w:sz w:val="18"/>
                 <w:szCs w:val="18"/>
               </w:rPr>
-              <w:t xml:space="preserve">El objetivo de hoy es consolidar el dominio del OA 1 resolviendo y justificando preguntas formales de cuatro alternativas bajo los estándares oficiales del Ministerio de Educación.</w:t>
+              <w:t xml:space="preserve">El objetivo de la lección es integrar los contenidos de sexualidad y pubertad, aplicando el análisis riguroso para resolver reactivos psicométricos tipo Examen Libre MINEDUC.</w:t>
             </w:r>
           </w:p>
         </w:tc>
@@ -27483,7 +27483,7 @@
                 <w:sz w:val="17"/>
                 <w:szCs w:val="17"/>
               </w:rPr>
-              <w:t xml:space="preserve">Duración asignada: 12 s</w:t>
+              <w:t xml:space="preserve">Duración asignada: 11 s</w:t>
             </w:r>
           </w:p>
         </w:tc>
@@ -27563,7 +27563,7 @@
                 <w:sz w:val="17"/>
                 <w:szCs w:val="17"/>
               </w:rPr>
-              <w:t xml:space="preserve">Modern anime style. Infographic displaying three typical distractors in multiple-choice exams: 'Reduccionismo', 'Falsedad Conceptual' y 'Verdad Incompleta'. Clean minimalist typography. No text drawn by AI.</w:t>
+              <w:t xml:space="preserve">Modern anime style 16:9 widescreen illustration. Two 13-year-old student explorers, a girl with braided hair and a boy in a teal jacket, pointing at the correct option B on the screen, highlighted by a subtle green aura of valid scientific evidence, with generous negative space for text overlays. No text drawn by AI.</w:t>
             </w:r>
           </w:p>
           <w:p>
@@ -27606,7 +27606,7 @@
                 <w:sz w:val="18"/>
                 <w:szCs w:val="18"/>
               </w:rPr>
-              <w:t xml:space="preserve">En un examen de 4 alternativas, los distractores suelen ser de tres tipos: falsedades biológicas directas, reduccionismos que olvidan las demás dimensiones, o afirmaciones ciertas pero incompletas.</w:t>
+              <w:t xml:space="preserve">El análisis de reactivos formales exige leer con atención el enunciado e identificar la variable disciplinaria central antes de revisar las alternativas de respuesta.</w:t>
             </w:r>
           </w:p>
         </w:tc>
@@ -27658,7 +27658,7 @@
                 <w:sz w:val="17"/>
                 <w:szCs w:val="17"/>
               </w:rPr>
-              <w:t xml:space="preserve">Duración asignada: 12 s</w:t>
+              <w:t xml:space="preserve">Duración asignada: 8 s</w:t>
             </w:r>
           </w:p>
         </w:tc>
@@ -27738,7 +27738,7 @@
                 <w:sz w:val="17"/>
                 <w:szCs w:val="17"/>
               </w:rPr>
-              <w:t xml:space="preserve">Modern anime style. Highlighting marker zooming into the core prompt of an exam item, isolating key verbs and biological conditions. Clear neon accents. No text drawn by AI.</w:t>
+              <w:t xml:space="preserve">Modern anime style 16:9 widescreen illustration. Two 13-year-old student explorers, a girl with braided hair and a boy in a teal jacket, demonstrating the systematic discard of distractors A, C, and D with clinical reasoning on a digital display, with generous negative space for text overlays. No text drawn by AI.</w:t>
             </w:r>
           </w:p>
           <w:p>
@@ -27781,7 +27781,7 @@
                 <w:sz w:val="18"/>
                 <w:szCs w:val="18"/>
               </w:rPr>
-              <w:t xml:space="preserve">Antes de mirar las alternativas, leemos el enunciado: ¿me piden refutar una idea errónea, identificar una causa biológica o seleccionar una actitud de autocuidado? Saber esto evita confusiones.</w:t>
+              <w:t xml:space="preserve">El método de resolución descarta sistemáticamente distractores que presenten reduccionismos biológicos, afirmaciones absolutas falsas o confusiones conceptuales.</w:t>
             </w:r>
           </w:p>
         </w:tc>
@@ -27833,7 +27833,7 @@
                 <w:sz w:val="17"/>
                 <w:szCs w:val="17"/>
               </w:rPr>
-              <w:t xml:space="preserve">Duración asignada: 12 s</w:t>
+              <w:t xml:space="preserve">Duración asignada: 10 s</w:t>
             </w:r>
           </w:p>
         </w:tc>
@@ -27913,7 +27913,7 @@
                 <w:sz w:val="17"/>
                 <w:szCs w:val="17"/>
               </w:rPr>
-              <w:t xml:space="preserve">Modern anime style. Four floating cards labeled A, B, C, D with checkmarks and cross marks, glowing softly. High-contrast modern interface. No text drawn by AI.</w:t>
+              <w:t xml:space="preserve">Modern anime style 16:9 widescreen illustration. Two 13-year-old student explorers, a girl with braided hair and a boy in a teal jacket, standing beside four solid pillars representing dimensions, pubertal hormones, consent, and scientific evidence, with generous negative space for text overlays. No text drawn by AI.</w:t>
             </w:r>
           </w:p>
           <w:p>
@@ -27956,7 +27956,7 @@
                 <w:sz w:val="18"/>
                 <w:szCs w:val="18"/>
               </w:rPr>
-              <w:t xml:space="preserve">Examinamos las cuatro alternativas una por una. Si una opción contiene una sola palabra incorrecta o excluye dimensiones fundamentales del ser humano, se descarta sin vacilación.</w:t>
+              <w:t xml:space="preserve">La justificación de la clave correcta debe articular la evidencia biológica con las dimensiones afectivas y éticas aprobadas en las Bases Curriculares nacionales.</w:t>
             </w:r>
           </w:p>
         </w:tc>
@@ -28008,7 +28008,7 @@
                 <w:sz w:val="17"/>
                 <w:szCs w:val="17"/>
               </w:rPr>
-              <w:t xml:space="preserve">Duración asignada: 12 s</w:t>
+              <w:t xml:space="preserve">Duración asignada: 10 s</w:t>
             </w:r>
           </w:p>
         </w:tc>
@@ -28088,7 +28088,7 @@
                 <w:sz w:val="17"/>
                 <w:szCs w:val="17"/>
               </w:rPr>
-              <w:t xml:space="preserve">Modern anime style. The girl and boy smiling confidently as a luminous gold medal and certificate appear with the message: 'Justificación Completa y Exitosa'. Beautiful composition. No text drawn by AI.</w:t>
+              <w:t xml:space="preserve">Modern anime style 16:9 widescreen illustration. Two 13-year-old student explorers, a girl with braided hair and a boy in a teal jacket, reviewing an official bubble answer sheet on their study desk, calm and confident with plenty of time, with generous negative space for text overlays. No text drawn by AI.</w:t>
             </w:r>
           </w:p>
           <w:p>
@@ -28131,7 +28131,7 @@
                 <w:sz w:val="18"/>
                 <w:szCs w:val="18"/>
               </w:rPr>
-              <w:t xml:space="preserve">La clave correcta es siempre la que resuelve la situación planteada de manera holística, sin caer en sesgos ni ignorar la evidencia científica ni la dignidad de la persona.</w:t>
+              <w:t xml:space="preserve">La gestión del tiempo en la evaluación formal requiere calma y seguridad: fundamentar cada elección en conceptos científicos estudiados en el cuaderno.</w:t>
             </w:r>
           </w:p>
         </w:tc>
@@ -28183,7 +28183,7 @@
                 <w:sz w:val="17"/>
                 <w:szCs w:val="17"/>
               </w:rPr>
-              <w:t xml:space="preserve">Duración asignada: 34 s</w:t>
+              <w:t xml:space="preserve">Duración asignada: 24 s</w:t>
             </w:r>
           </w:p>
         </w:tc>
@@ -28263,7 +28263,7 @@
                 <w:sz w:val="17"/>
                 <w:szCs w:val="17"/>
               </w:rPr>
-              <w:t xml:space="preserve">Modern anime style 16:9. The boy and girl analyzing an official MINEDUC test item displayed on an interactive board, pointing to Option B with green neon highlight while crossing out A, C, D with red dashed lines. Clear readable diagram. No text drawn by AI.</w:t>
+              <w:t xml:space="preserve">Modern anime style 16:9 widescreen illustration. Two 13-year-old student explorers, a girl with braided hair and a boy in a teal jacket, analyzing an official four-choice exam card on their desk, comparing reasoning notes before selecting option B, with generous negative space for text overlays. No text drawn by AI.</w:t>
             </w:r>
           </w:p>
           <w:p>
@@ -28306,7 +28306,7 @@
                 <w:sz w:val="18"/>
                 <w:szCs w:val="18"/>
               </w:rPr>
-              <w:t xml:space="preserve">Analicemos un caso de examen oficial: Un estudiante afirma que la sexualidad se limita exclusivamente a los procesos biológicos de maduración reproductiva. ¿Cuál de las siguientes opciones refuta con mayor precisión científica dicha afirmación? Opción A: Es correcta porque las hormonas son lo único medible. Opción B: Es incompleta porque la sexualidad es una dimensión integral que involucra aspectos biológicos, afectivos, psicológicos, socioculturales y éticos. Opción C: Es incorrecta porque la sexualidad solo comienza en la adultez. Opción D: Es válida solo para la pubertad pues en la niñez no hay afectos. La respuesta correcta es la opción B, porque el currículum de Ciencias y la OMS definen la sexualidad como una vivencia holística que integra las cinco dimensiones humanas a lo largo de toda la vida, desestimando el reduccionismo biológico.</w:t>
+              <w:t xml:space="preserve">Analicemos un ítem modelado: un estudiante afirma que la sexualidad se limita exclusivamente a órganos y procreación. A partir del MINEDUC, ¿cuál opción refuta dicha postura? La opción B es correcta porque establece que la sexualidad es una dimensión integral que une lo biológico, afectivo, psicológico, sociocultural y ético durante toda la vida.</w:t>
             </w:r>
           </w:p>
         </w:tc>
@@ -28358,7 +28358,7 @@
                 <w:sz w:val="17"/>
                 <w:szCs w:val="17"/>
               </w:rPr>
-              <w:t xml:space="preserve">Duración asignada: 11 s</w:t>
+              <w:t xml:space="preserve">Duración asignada: 15 s</w:t>
             </w:r>
           </w:p>
         </w:tc>
@@ -28388,7 +28388,7 @@
                 <w:sz w:val="18"/>
                 <w:szCs w:val="18"/>
               </w:rPr>
-              <w:t xml:space="preserve">El camino hacia la excelencia</w:t>
+              <w:t xml:space="preserve">Regla de Oro de la síntesis de ciencias</w:t>
             </w:r>
           </w:p>
           <w:p>
@@ -28438,7 +28438,7 @@
                 <w:sz w:val="17"/>
                 <w:szCs w:val="17"/>
               </w:rPr>
-              <w:t xml:space="preserve">Modern anime style. The complete StudioSimple golden crest shining over the open science notebook: 'OA 1 Dominado: Ciencias 7° Básico'. Elegant celebration of mastery. No text drawn by AI.</w:t>
+              <w:t xml:space="preserve">Modern anime style 16:9 widescreen illustration. Two 13-year-old student explorers, a girl with braided hair and a boy in a teal jacket, presenting a golden laurel emblem of curricular mastery in Ciencias Naturales OA 01 beside a StudioSimple badge, with generous negative space for text overlays. No text drawn by AI.</w:t>
             </w:r>
           </w:p>
           <w:p>
@@ -28481,7 +28481,7 @@
                 <w:sz w:val="18"/>
                 <w:szCs w:val="18"/>
               </w:rPr>
-              <w:t xml:space="preserve">Has completado la ruta formativa del OA 1. Con este entrenamiento riguroso estás plenamente preparado para responder con seguridad cualquier evaluación oficial. ¡A demostrarlo en la práctica!</w:t>
+              <w:t xml:space="preserve">Recuerda la regla de oro: la justificación científica y el descarte de distractores aseguran el éxito en el examen. ¡Ahora pon a prueba lo aprendido resolviendo las actividades prácticas en la plataforma interactiva!</w:t>
             </w:r>
           </w:p>
         </w:tc>
@@ -28509,10 +28509,17 @@
           <w:b/>
           <w:bCs/>
         </w:rPr>
-        <w:t xml:space="preserve">Comprobación 1 (Verificación de descarte): </w:t>
-      </w:r>
-      <w:r>
-        <w:t xml:space="preserve">En el reactivo modelado, ¿por qué la opción A ('las hormonas son lo único medible') es científicamente inaceptable?</w:t>
+        <w:t xml:space="preserve">Comprobación 1 (Caso 1: Ítem oficial de selección múltiple (Estándar MINEDUC)): </w:t>
+      </w:r>
+      <w:r>
+        <w:t xml:space="preserve">Un examen oficial presenta la siguiente pregunta de selección múltiple:
+'Durante una clase de Ciencias Naturales, los estudiantes debaten sobre la sexualidad humana. Uno de ellos afirma que la sexualidad se limita exclusivamente a los procesos biológicos de maduración de los órganos reproductores y a la capacidad de procrear.'
+A partir de las Bases Curriculares del MINEDUC, ¿cuál de las siguientes opciones refuta con mayor precisión científica y pedagógica dicha afirmación?
+A) La afirmación es correcta porque las hormonas y los caracteres sexuales primarios son las únicas variables medibles empíricamente.
+B) La afirmación es incompleta porque la sexualidad humana es una dimensión integral que involucra aspectos biológicos, afectivos, psicológicos, socioculturales y éticos a lo largo de toda la vida.
+C) La afirmación es incorrecta porque la sexualidad solo comienza en la adultez cuando se forman vínculos legales formales.
+D) La afirmación es válida únicamente para la etapa de la pubertad, pues en la niñez no existen influencias afectivas ni sociales.
+Indica la alternativa correcta y justifica por qué descartaste las otras tres opciones.</w:t>
       </w:r>
     </w:p>
     <w:p>
@@ -28528,7 +28535,7 @@
         <w:t xml:space="preserve">• Respuesta esperada: </w:t>
       </w:r>
       <w:r>
-        <w:t xml:space="preserve">Porque incurre en un reduccionismo cientificista que ignora la validez empírica de la psicología, la sociología y la ética en la conducta humana.</w:t>
+        <w:t xml:space="preserve">La alternativa correcta es la B. Se descarta la opción A porque es un reduccionismo biológico falso; se descarta la C porque la sexualidad se vive en todas las etapas del ciclo vital y no solo en la adultez; y se descarta la D porque las dimensiones afectivas y sociales están presentes desde la primera infancia.</w:t>
       </w:r>
       <w:r>
         <w:rPr>
@@ -28539,7 +28546,7 @@
         <w:t xml:space="preserve"> | Pista socrática: </w:t>
       </w:r>
       <w:r>
-        <w:t xml:space="preserve">Considera si los sentimientos, las normas y las relaciones se pueden explicar solo con probetas de laboratorio.</w:t>
+        <w:t xml:space="preserve">Recuerda el caso modelado en el video: identifica la opción que describe la sexualidad como una vivencia integral y explica los fallos de las demás.</w:t>
       </w:r>
     </w:p>
     <w:p>
@@ -28555,7 +28562,7 @@
         <w:t xml:space="preserve">• Texto revelado al estudiante: </w:t>
       </w:r>
       <w:r>
-        <w:t xml:space="preserve">Porque es un reduccionismo que ignora los sentimientos, los valores y las relaciones humanas.</w:t>
+        <w:t xml:space="preserve">La correcta es la B. La A es falsa por reduccionista, la C porque la sexualidad dura toda la vida y la D porque el afecto existe desde que nacemos.</w:t>
       </w:r>
     </w:p>
     <w:p>
@@ -28567,10 +28574,15 @@
           <w:b/>
           <w:bCs/>
         </w:rPr>
-        <w:t xml:space="preserve">Comprobación 2 (Justificación de la opción B): </w:t>
-      </w:r>
-      <w:r>
-        <w:t xml:space="preserve">¿Qué elemento fundamental hace que la opción B sea la respuesta perfecta según el MINEDUC?</w:t>
+        <w:t xml:space="preserve">Comprobación 2 (Caso 2: Ítem de aplicación sobre caracteres sexuales y hormonas): </w:t>
+      </w:r>
+      <w:r>
+        <w:t xml:space="preserve">Un ítem del examen pregunta: '¿Qué relación de causalidad existe entre la secreción de testosterona en los testículos durante la pubertad y la aparición de caracteres sexuales secundarios en el varón?'
+A) La testosterona inhibe el desarrollo muscular para permitir el cambio de tono de voz.
+B) La testosterona estimula el crecimiento de la laringe, el desarrollo óseo-muscular y la aparición de vello facial y corporal.
+C) La testosterona solo actúa sobre los túbulos seminíferos y no tiene efectos en el resto del cuerpo.
+D) La testosterona es producida por la hipófisis y destruye las glándulas sudoríparas.
+Selecciona la alternativa correcta y explica brevemente su funcionamiento biológico.</w:t>
       </w:r>
     </w:p>
     <w:p>
@@ -28586,7 +28598,7 @@
         <w:t xml:space="preserve">• Respuesta esperada: </w:t>
       </w:r>
       <w:r>
-        <w:t xml:space="preserve">Que menciona explícitamente el carácter integral de la sexualidad humana y nombra las dimensiones biológica, afectiva, psicológica, sociocultural y ética a lo largo de toda la vida.</w:t>
+        <w:t xml:space="preserve">La alternativa correcta es la B. La testosterona es la hormona esteroidea producida en las células de Leydig de los testículos que, al circular por la sangre, estimula los receptores de tejidos blanco provocando engrosamiento de cuerdas vocales, masa muscular y vello corporal.</w:t>
       </w:r>
       <w:r>
         <w:rPr>
@@ -28597,7 +28609,7 @@
         <w:t xml:space="preserve"> | Pista socrática: </w:t>
       </w:r>
       <w:r>
-        <w:t xml:space="preserve">Revisa qué componentes del marco curricular chileno están presentes en esa alternativa.</w:t>
+        <w:t xml:space="preserve">Analiza el rol de la testosterona en el cuerpo masculino: ¿estimula o inhibe el crecimiento de tejidos?</w:t>
       </w:r>
     </w:p>
     <w:p>
@@ -28613,7 +28625,7 @@
         <w:t xml:space="preserve">• Texto revelado al estudiante: </w:t>
       </w:r>
       <w:r>
-        <w:t xml:space="preserve">Porque define la sexualidad como algo integral que incluye las 5 dimensiones en toda la vida.</w:t>
+        <w:t xml:space="preserve">La alternativa B, porque la testosterona estimula la laringe, los músculos y el vello.</w:t>
       </w:r>
     </w:p>
     <w:p>

</xml_diff>